<commit_message>
Add catalog admin dashboard and update API usage guide.
Co-authored-by: Cursor <cursoragent@cursor.com>
</commit_message>
<xml_diff>
--- a/docs/DominioDeLaSierra-Uso-API-v1.docx
+++ b/docs/DominioDeLaSierra-Uso-API-v1.docx
@@ -3,9 +3,6 @@
 <w:document xmlns:wpc="http://schemas.microsoft.com/office/word/2010/wordprocessingCanvas" xmlns:mo="http://schemas.microsoft.com/office/mac/office/2008/main" xmlns:mc="http://schemas.openxmlformats.org/markup-compatibility/2006" xmlns:mv="urn:schemas-microsoft-com:mac:vml" xmlns:o="urn:schemas-microsoft-com:office:office" xmlns:r="http://schemas.openxmlformats.org/officeDocument/2006/relationships" xmlns:m="http://schemas.openxmlformats.org/officeDocument/2006/math" xmlns:v="urn:schemas-microsoft-com:vml" xmlns:wp14="http://schemas.microsoft.com/office/word/2010/wordprocessingDrawing" xmlns:wp="http://schemas.openxmlformats.org/drawingml/2006/wordprocessingDrawing" xmlns:w10="urn:schemas-microsoft-com:office:word" xmlns:w="http://schemas.openxmlformats.org/wordprocessingml/2006/main" xmlns:w14="http://schemas.microsoft.com/office/word/2010/wordml" xmlns:wpg="http://schemas.microsoft.com/office/word/2010/wordprocessingGroup" xmlns:wpi="http://schemas.microsoft.com/office/word/2010/wordprocessingInk" xmlns:wne="http://schemas.microsoft.com/office/word/2006/wordml" xmlns:wps="http://schemas.microsoft.com/office/word/2010/wordprocessingShape" mc:Ignorable="w14 wp14">
   <w:body>
     <w:p>
-      <w:pPr>
-        <w:jc w:val="left"/>
-      </w:pPr>
       <w:r>
         <w:rPr>
           <w:rFonts w:ascii="Calibri" w:hAnsi="Calibri" w:eastAsia="Calibri"/>
@@ -35,7 +32,7 @@
           <w:color w:val="5C5450"/>
           <w:sz w:val="20"/>
         </w:rPr>
-        <w:t>Versión 1.0  ·  27/09/2026  ·  Contrato HTTP /api/v1  ·  Uso interno de desarrollo</w:t>
+        <w:t>Versión 1.1  ·  27/09/2026  ·  Contrato HTTP /api/v1  ·  Panel interno /admin  ·  Uso interno</w:t>
       </w:r>
     </w:p>
     <w:p>
@@ -49,7 +46,7 @@
           <w:color w:val="1D1917"/>
           <w:sz w:val="22"/>
         </w:rPr>
-        <w:t>Este documento describe cómo arrancar, invocar y interpretar la API pública de catálogo en el estado actual del sistema. No cubre pedidos, pagos, facturación ni VeriFactu: esos módulos no están implementados todavía.</w:t>
+        <w:t>Este documento describe cómo arrancar la API, invocar los endpoints públicos de catálogo y usar el panel interno de alta de productos. No cubre pedidos, pagos, facturación ni VeriFactu.</w:t>
       </w:r>
     </w:p>
     <w:p>
@@ -61,52 +58,302 @@
           <w:rFonts w:ascii="Calibri" w:hAnsi="Calibri"/>
           <w:color w:val="421F25"/>
         </w:rPr>
-        <w:t>1. Alcance actual</w:t>
+        <w:t>1. Resumen de superficies</w:t>
       </w:r>
     </w:p>
-    <w:p>
-      <w:pPr>
-        <w:spacing w:after="160"/>
-      </w:pPr>
-      <w:r>
-        <w:rPr>
-          <w:rFonts w:ascii="Calibri" w:hAnsi="Calibri" w:eastAsia="Calibri"/>
-          <w:b w:val="0"/>
-          <w:color w:val="1D1917"/>
-          <w:sz w:val="22"/>
-        </w:rPr>
-        <w:t>La API expone un único recurso de lectura para el catálogo de ecommerce:</w:t>
-      </w:r>
-    </w:p>
-    <w:p>
-      <w:pPr>
-        <w:spacing w:after="200"/>
-        <w:ind w:left="283"/>
-      </w:pPr>
-      <w:r>
-        <w:rPr>
-          <w:rFonts w:ascii="Consolas" w:hAnsi="Consolas" w:eastAsia="Consolas"/>
-          <w:b w:val="0"/>
-          <w:color w:val="1D1917"/>
-          <w:sz w:val="19"/>
-        </w:rPr>
-        <w:t>GET /api/v1/products</w:t>
-      </w:r>
-    </w:p>
-    <w:p>
-      <w:pPr>
-        <w:spacing w:after="160"/>
-      </w:pPr>
-      <w:r>
-        <w:rPr>
-          <w:rFonts w:ascii="Calibri" w:hAnsi="Calibri" w:eastAsia="Calibri"/>
-          <w:b w:val="0"/>
-          <w:color w:val="1D1917"/>
-          <w:sz w:val="22"/>
-        </w:rPr>
-        <w:t>El backend es la fuente de verdad de precios, IVA, visibilidad (Active) y paginación. El cliente (Angular, Swagger, Postman o scripts) no debe recalcular el catálogo ni enviar precios.</w:t>
-      </w:r>
-    </w:p>
+    <w:tbl>
+      <w:tblPr>
+        <w:tblStyle w:val="TableGrid"/>
+        <w:tblW w:type="auto" w:w="0"/>
+        <w:tblLook w:firstColumn="1" w:firstRow="1" w:lastColumn="0" w:lastRow="0" w:noHBand="0" w:noVBand="1" w:val="04A0"/>
+      </w:tblPr>
+      <w:tblGrid>
+        <w:gridCol w:w="3249"/>
+        <w:gridCol w:w="3249"/>
+        <w:gridCol w:w="3249"/>
+      </w:tblGrid>
+      <w:tr>
+        <w:tc>
+          <w:tcPr>
+            <w:tcW w:type="dxa" w:w="3249"/>
+            <w:shd w:fill="421F25" w:val="clear"/>
+          </w:tcPr>
+          <w:p>
+            <w:r/>
+            <w:r>
+              <w:rPr>
+                <w:rFonts w:ascii="Calibri" w:hAnsi="Calibri" w:eastAsia="Calibri"/>
+                <w:b/>
+                <w:color w:val="FFFFFF"/>
+                <w:sz w:val="20"/>
+              </w:rPr>
+              <w:t>Superficie</w:t>
+            </w:r>
+          </w:p>
+        </w:tc>
+        <w:tc>
+          <w:tcPr>
+            <w:tcW w:type="dxa" w:w="3249"/>
+            <w:shd w:fill="421F25" w:val="clear"/>
+          </w:tcPr>
+          <w:p>
+            <w:r/>
+            <w:r>
+              <w:rPr>
+                <w:rFonts w:ascii="Calibri" w:hAnsi="Calibri" w:eastAsia="Calibri"/>
+                <w:b/>
+                <w:color w:val="FFFFFF"/>
+                <w:sz w:val="20"/>
+              </w:rPr>
+              <w:t>URL</w:t>
+            </w:r>
+          </w:p>
+        </w:tc>
+        <w:tc>
+          <w:tcPr>
+            <w:tcW w:type="dxa" w:w="3249"/>
+            <w:shd w:fill="421F25" w:val="clear"/>
+          </w:tcPr>
+          <w:p>
+            <w:r/>
+            <w:r>
+              <w:rPr>
+                <w:rFonts w:ascii="Calibri" w:hAnsi="Calibri" w:eastAsia="Calibri"/>
+                <w:b/>
+                <w:color w:val="FFFFFF"/>
+                <w:sz w:val="20"/>
+              </w:rPr>
+              <w:t>Uso</w:t>
+            </w:r>
+          </w:p>
+        </w:tc>
+      </w:tr>
+      <w:tr>
+        <w:tc>
+          <w:tcPr>
+            <w:tcW w:type="dxa" w:w="3249"/>
+            <w:shd w:fill="FFFFFF" w:val="clear"/>
+          </w:tcPr>
+          <w:p>
+            <w:r/>
+            <w:r>
+              <w:rPr>
+                <w:rFonts w:ascii="Calibri" w:hAnsi="Calibri" w:eastAsia="Calibri"/>
+                <w:b w:val="0"/>
+                <w:color w:val="1D1917"/>
+                <w:sz w:val="20"/>
+              </w:rPr>
+              <w:t>API JSON pública</w:t>
+            </w:r>
+          </w:p>
+        </w:tc>
+        <w:tc>
+          <w:tcPr>
+            <w:tcW w:type="dxa" w:w="3249"/>
+            <w:shd w:fill="FFFFFF" w:val="clear"/>
+          </w:tcPr>
+          <w:p>
+            <w:r/>
+            <w:r>
+              <w:rPr>
+                <w:rFonts w:ascii="Calibri" w:hAnsi="Calibri" w:eastAsia="Calibri"/>
+                <w:b w:val="0"/>
+                <w:color w:val="1D1917"/>
+                <w:sz w:val="20"/>
+              </w:rPr>
+              <w:t>http://localhost:5141/api/v1/…</w:t>
+            </w:r>
+          </w:p>
+        </w:tc>
+        <w:tc>
+          <w:tcPr>
+            <w:tcW w:type="dxa" w:w="3249"/>
+            <w:shd w:fill="FFFFFF" w:val="clear"/>
+          </w:tcPr>
+          <w:p>
+            <w:r/>
+            <w:r>
+              <w:rPr>
+                <w:rFonts w:ascii="Calibri" w:hAnsi="Calibri" w:eastAsia="Calibri"/>
+                <w:b w:val="0"/>
+                <w:color w:val="1D1917"/>
+                <w:sz w:val="20"/>
+              </w:rPr>
+              <w:t>Ecommerce Angular y clientes HTTP.</w:t>
+            </w:r>
+          </w:p>
+        </w:tc>
+      </w:tr>
+      <w:tr>
+        <w:tc>
+          <w:tcPr>
+            <w:tcW w:type="dxa" w:w="3249"/>
+            <w:shd w:fill="F7F3EE" w:val="clear"/>
+          </w:tcPr>
+          <w:p>
+            <w:r/>
+            <w:r>
+              <w:rPr>
+                <w:rFonts w:ascii="Calibri" w:hAnsi="Calibri" w:eastAsia="Calibri"/>
+                <w:b w:val="0"/>
+                <w:color w:val="1D1917"/>
+                <w:sz w:val="20"/>
+              </w:rPr>
+              <w:t>Swagger</w:t>
+            </w:r>
+          </w:p>
+        </w:tc>
+        <w:tc>
+          <w:tcPr>
+            <w:tcW w:type="dxa" w:w="3249"/>
+            <w:shd w:fill="F7F3EE" w:val="clear"/>
+          </w:tcPr>
+          <w:p>
+            <w:r/>
+            <w:r>
+              <w:rPr>
+                <w:rFonts w:ascii="Calibri" w:hAnsi="Calibri" w:eastAsia="Calibri"/>
+                <w:b w:val="0"/>
+                <w:color w:val="1D1917"/>
+                <w:sz w:val="20"/>
+              </w:rPr>
+              <w:t>http://localhost:5141/swagger</w:t>
+            </w:r>
+          </w:p>
+        </w:tc>
+        <w:tc>
+          <w:tcPr>
+            <w:tcW w:type="dxa" w:w="3249"/>
+            <w:shd w:fill="F7F3EE" w:val="clear"/>
+          </w:tcPr>
+          <w:p>
+            <w:r/>
+            <w:r>
+              <w:rPr>
+                <w:rFonts w:ascii="Calibri" w:hAnsi="Calibri" w:eastAsia="Calibri"/>
+                <w:b w:val="0"/>
+                <w:color w:val="1D1917"/>
+                <w:sz w:val="20"/>
+              </w:rPr>
+              <w:t>Probar GET en Development.</w:t>
+            </w:r>
+          </w:p>
+        </w:tc>
+      </w:tr>
+      <w:tr>
+        <w:tc>
+          <w:tcPr>
+            <w:tcW w:type="dxa" w:w="3249"/>
+            <w:shd w:fill="FFFFFF" w:val="clear"/>
+          </w:tcPr>
+          <w:p>
+            <w:r/>
+            <w:r>
+              <w:rPr>
+                <w:rFonts w:ascii="Calibri" w:hAnsi="Calibri" w:eastAsia="Calibri"/>
+                <w:b w:val="0"/>
+                <w:color w:val="1D1917"/>
+                <w:sz w:val="20"/>
+              </w:rPr>
+              <w:t>Panel de catálogo</w:t>
+            </w:r>
+          </w:p>
+        </w:tc>
+        <w:tc>
+          <w:tcPr>
+            <w:tcW w:type="dxa" w:w="3249"/>
+            <w:shd w:fill="FFFFFF" w:val="clear"/>
+          </w:tcPr>
+          <w:p>
+            <w:r/>
+            <w:r>
+              <w:rPr>
+                <w:rFonts w:ascii="Calibri" w:hAnsi="Calibri" w:eastAsia="Calibri"/>
+                <w:b w:val="0"/>
+                <w:color w:val="1D1917"/>
+                <w:sz w:val="20"/>
+              </w:rPr>
+              <w:t>http://localhost:5141/admin</w:t>
+            </w:r>
+          </w:p>
+        </w:tc>
+        <w:tc>
+          <w:tcPr>
+            <w:tcW w:type="dxa" w:w="3249"/>
+            <w:shd w:fill="FFFFFF" w:val="clear"/>
+          </w:tcPr>
+          <w:p>
+            <w:r/>
+            <w:r>
+              <w:rPr>
+                <w:rFonts w:ascii="Calibri" w:hAnsi="Calibri" w:eastAsia="Calibri"/>
+                <w:b w:val="0"/>
+                <w:color w:val="1D1917"/>
+                <w:sz w:val="20"/>
+              </w:rPr>
+              <w:t>Ver PostgreSQL y crear categorías/productos. Solo Development.</w:t>
+            </w:r>
+          </w:p>
+        </w:tc>
+      </w:tr>
+      <w:tr>
+        <w:tc>
+          <w:tcPr>
+            <w:tcW w:type="dxa" w:w="3249"/>
+            <w:shd w:fill="F7F3EE" w:val="clear"/>
+          </w:tcPr>
+          <w:p>
+            <w:r/>
+            <w:r>
+              <w:rPr>
+                <w:rFonts w:ascii="Calibri" w:hAnsi="Calibri" w:eastAsia="Calibri"/>
+                <w:b w:val="0"/>
+                <w:color w:val="1D1917"/>
+                <w:sz w:val="20"/>
+              </w:rPr>
+              <w:t>Front Angular</w:t>
+            </w:r>
+          </w:p>
+        </w:tc>
+        <w:tc>
+          <w:tcPr>
+            <w:tcW w:type="dxa" w:w="3249"/>
+            <w:shd w:fill="F7F3EE" w:val="clear"/>
+          </w:tcPr>
+          <w:p>
+            <w:r/>
+            <w:r>
+              <w:rPr>
+                <w:rFonts w:ascii="Calibri" w:hAnsi="Calibri" w:eastAsia="Calibri"/>
+                <w:b w:val="0"/>
+                <w:color w:val="1D1917"/>
+                <w:sz w:val="20"/>
+              </w:rPr>
+              <w:t>http://localhost:4200</w:t>
+            </w:r>
+          </w:p>
+        </w:tc>
+        <w:tc>
+          <w:tcPr>
+            <w:tcW w:type="dxa" w:w="3249"/>
+            <w:shd w:fill="F7F3EE" w:val="clear"/>
+          </w:tcPr>
+          <w:p>
+            <w:r/>
+            <w:r>
+              <w:rPr>
+                <w:rFonts w:ascii="Calibri" w:hAnsi="Calibri" w:eastAsia="Calibri"/>
+                <w:b w:val="0"/>
+                <w:color w:val="1D1917"/>
+                <w:sz w:val="20"/>
+              </w:rPr>
+              <w:t>Catálogo público (vinos y ficha).</w:t>
+            </w:r>
+          </w:p>
+        </w:tc>
+      </w:tr>
+    </w:tbl>
+    <w:p/>
     <w:p>
       <w:pPr>
         <w:pStyle w:val="Heading1"/>
@@ -135,7 +382,6 @@
       <w:tblPr>
         <w:tblStyle w:val="TableGrid"/>
         <w:tblW w:type="auto" w:w="0"/>
-        <w:tblLayout w:type="autofit"/>
         <w:tblLook w:firstColumn="1" w:firstRow="1" w:lastColumn="0" w:lastRow="0" w:noHBand="0" w:noVBand="1" w:val="04A0"/>
       </w:tblPr>
       <w:tblGrid>
@@ -251,7 +497,7 @@
                 <w:color w:val="1D1917"/>
                 <w:sz w:val="20"/>
               </w:rPr>
-              <w:t>PostgreSQL 17 (Docker)</w:t>
+              <w:t>PostgreSQL 17 (Docker), contenedor dominio-sierra-postgres</w:t>
             </w:r>
           </w:p>
         </w:tc>
@@ -271,7 +517,7 @@
                 <w:color w:val="1D1917"/>
                 <w:sz w:val="20"/>
               </w:rPr>
-              <w:t>Contenedor</w:t>
+              <w:t>Base / usuario</w:t>
             </w:r>
           </w:p>
         </w:tc>
@@ -289,83 +535,7 @@
                 <w:color w:val="1D1917"/>
                 <w:sz w:val="20"/>
               </w:rPr>
-              <w:t>dominio-sierra-postgres</w:t>
-            </w:r>
-          </w:p>
-        </w:tc>
-      </w:tr>
-      <w:tr>
-        <w:tc>
-          <w:tcPr>
-            <w:tcW w:type="dxa" w:w="4873"/>
-            <w:shd w:fill="F7F3EE" w:val="clear"/>
-          </w:tcPr>
-          <w:p>
-            <w:r/>
-            <w:r>
-              <w:rPr>
-                <w:rFonts w:ascii="Calibri" w:hAnsi="Calibri" w:eastAsia="Calibri"/>
-                <w:b w:val="0"/>
-                <w:color w:val="1D1917"/>
-                <w:sz w:val="20"/>
-              </w:rPr>
-              <w:t>Base</w:t>
-            </w:r>
-          </w:p>
-        </w:tc>
-        <w:tc>
-          <w:tcPr>
-            <w:tcW w:type="dxa" w:w="4873"/>
-            <w:shd w:fill="F7F3EE" w:val="clear"/>
-          </w:tcPr>
-          <w:p>
-            <w:r/>
-            <w:r>
-              <w:rPr>
-                <w:rFonts w:ascii="Calibri" w:hAnsi="Calibri" w:eastAsia="Calibri"/>
-                <w:b w:val="0"/>
-                <w:color w:val="1D1917"/>
-                <w:sz w:val="20"/>
-              </w:rPr>
-              <w:t>dominio_sierra</w:t>
-            </w:r>
-          </w:p>
-        </w:tc>
-      </w:tr>
-      <w:tr>
-        <w:tc>
-          <w:tcPr>
-            <w:tcW w:type="dxa" w:w="4873"/>
-            <w:shd w:fill="FFFFFF" w:val="clear"/>
-          </w:tcPr>
-          <w:p>
-            <w:r/>
-            <w:r>
-              <w:rPr>
-                <w:rFonts w:ascii="Calibri" w:hAnsi="Calibri" w:eastAsia="Calibri"/>
-                <w:b w:val="0"/>
-                <w:color w:val="1D1917"/>
-                <w:sz w:val="20"/>
-              </w:rPr>
-              <w:t>Usuario</w:t>
-            </w:r>
-          </w:p>
-        </w:tc>
-        <w:tc>
-          <w:tcPr>
-            <w:tcW w:type="dxa" w:w="4873"/>
-            <w:shd w:fill="FFFFFF" w:val="clear"/>
-          </w:tcPr>
-          <w:p>
-            <w:r/>
-            <w:r>
-              <w:rPr>
-                <w:rFonts w:ascii="Calibri" w:hAnsi="Calibri" w:eastAsia="Calibri"/>
-                <w:b w:val="0"/>
-                <w:color w:val="1D1917"/>
-                <w:sz w:val="20"/>
-              </w:rPr>
-              <w:t>dominio_sierra_app</w:t>
+              <w:t>dominio_sierra / dominio_sierra_app</w:t>
             </w:r>
           </w:p>
         </w:tc>
@@ -403,7 +573,7 @@
                 <w:color w:val="1D1917"/>
                 <w:sz w:val="20"/>
               </w:rPr>
-              <w:t>Variable POSTGRES_PASSWORD en el archivo .env de la raíz (nunca en Git)</w:t>
+              <w:t>POSTGRES_PASSWORD en el .env de la raíz (nunca en Git)</w:t>
             </w:r>
           </w:p>
         </w:tc>
@@ -423,7 +593,7 @@
                 <w:color w:val="1D1917"/>
                 <w:sz w:val="20"/>
               </w:rPr>
-              <w:t>Puerto Postgres (host)</w:t>
+              <w:t>Puerto API (perfil http)</w:t>
             </w:r>
           </w:p>
         </w:tc>
@@ -441,7 +611,7 @@
                 <w:color w:val="1D1917"/>
                 <w:sz w:val="20"/>
               </w:rPr>
-              <w:t>5432</w:t>
+              <w:t>5141</w:t>
             </w:r>
           </w:p>
         </w:tc>
@@ -461,7 +631,7 @@
                 <w:color w:val="1D1917"/>
                 <w:sz w:val="20"/>
               </w:rPr>
-              <w:t>Puerto API (perfil http)</w:t>
+              <w:t>CORS</w:t>
             </w:r>
           </w:p>
         </w:tc>
@@ -479,7 +649,7 @@
                 <w:color w:val="1D1917"/>
                 <w:sz w:val="20"/>
               </w:rPr>
-              <w:t>5141</w:t>
+              <w:t>http://localhost:4200 y http://127.0.0.1:4200</w:t>
             </w:r>
           </w:p>
         </w:tc>
@@ -527,8 +697,6 @@
         <w:t>cd C:\Users\Aerus\Desktop\Dominio</w:t>
         <w:br/>
         <w:t>docker compose up -d</w:t>
-        <w:br/>
-        <w:t>docker ps</w:t>
       </w:r>
     </w:p>
     <w:p>
@@ -542,21 +710,7 @@
           <w:color w:val="1D1917"/>
           <w:sz w:val="22"/>
         </w:rPr>
-        <w:t>Comprobar que el contenedor aparece como healthy.</w:t>
-      </w:r>
-    </w:p>
-    <w:p>
-      <w:pPr>
-        <w:spacing w:after="80"/>
-      </w:pPr>
-      <w:r>
-        <w:rPr>
-          <w:rFonts w:ascii="Calibri" w:hAnsi="Calibri" w:eastAsia="Calibri"/>
-          <w:b/>
-          <w:color w:val="1D1917"/>
-          <w:sz w:val="22"/>
-        </w:rPr>
-        <w:t>API (perfil HTTP, el que usa Angular y Swagger en local):</w:t>
+        <w:t>API:</w:t>
       </w:r>
     </w:p>
     <w:p>
@@ -587,7 +741,7 @@
           <w:color w:val="1D1917"/>
           <w:sz w:val="22"/>
         </w:rPr>
-        <w:t>Cuando el log muestre la siguiente línea, la API está lista:</w:t>
+        <w:t>Listo cuando el log muestre:</w:t>
       </w:r>
     </w:p>
     <w:p>
@@ -607,6 +761,18 @@
     </w:p>
     <w:p>
       <w:pPr>
+        <w:pStyle w:val="Heading1"/>
+      </w:pPr>
+      <w:r>
+        <w:rPr>
+          <w:rFonts w:ascii="Calibri" w:hAnsi="Calibri"/>
+          <w:color w:val="421F25"/>
+        </w:rPr>
+        <w:t>3. Endpoints JSON públicos</w:t>
+      </w:r>
+    </w:p>
+    <w:p>
+      <w:pPr>
         <w:spacing w:after="160"/>
       </w:pPr>
       <w:r>
@@ -616,36 +782,24 @@
           <w:color w:val="1D1917"/>
           <w:sz w:val="22"/>
         </w:rPr>
-        <w:t>También se puede ejecutar el proyecto DominioDeLaSierra.Api desde Cursor o Visual Studio eligiendo el perfil de arranque «http».</w:t>
-      </w:r>
-    </w:p>
-    <w:p>
-      <w:pPr>
-        <w:pStyle w:val="Heading1"/>
-      </w:pPr>
-      <w:r>
-        <w:rPr>
-          <w:rFonts w:ascii="Calibri" w:hAnsi="Calibri"/>
-          <w:color w:val="421F25"/>
-        </w:rPr>
-        <w:t>3. URL base y convenciones</w:t>
+        <w:t>Autenticación: ninguna. JSON en camelCase. Solo lecturas de catálogo activo.</w:t>
       </w:r>
     </w:p>
     <w:tbl>
       <w:tblPr>
         <w:tblStyle w:val="TableGrid"/>
         <w:tblW w:type="auto" w:w="0"/>
-        <w:tblLayout w:type="autofit"/>
         <w:tblLook w:firstColumn="1" w:firstRow="1" w:lastColumn="0" w:lastRow="0" w:noHBand="0" w:noVBand="1" w:val="04A0"/>
       </w:tblPr>
       <w:tblGrid>
-        <w:gridCol w:w="4873"/>
-        <w:gridCol w:w="4873"/>
+        <w:gridCol w:w="3249"/>
+        <w:gridCol w:w="3249"/>
+        <w:gridCol w:w="3249"/>
       </w:tblGrid>
       <w:tr>
         <w:tc>
           <w:tcPr>
-            <w:tcW w:type="dxa" w:w="4873"/>
+            <w:tcW w:type="dxa" w:w="3249"/>
             <w:shd w:fill="421F25" w:val="clear"/>
           </w:tcPr>
           <w:p>
@@ -657,13 +811,13 @@
                 <w:color w:val="FFFFFF"/>
                 <w:sz w:val="20"/>
               </w:rPr>
-              <w:t>Concepto</w:t>
+              <w:t>Método</w:t>
             </w:r>
           </w:p>
         </w:tc>
         <w:tc>
           <w:tcPr>
-            <w:tcW w:type="dxa" w:w="4873"/>
+            <w:tcW w:type="dxa" w:w="3249"/>
             <w:shd w:fill="421F25" w:val="clear"/>
           </w:tcPr>
           <w:p>
@@ -675,332 +829,13 @@
                 <w:color w:val="FFFFFF"/>
                 <w:sz w:val="20"/>
               </w:rPr>
-              <w:t>Valor</w:t>
-            </w:r>
-          </w:p>
-        </w:tc>
-      </w:tr>
-      <w:tr>
-        <w:tc>
-          <w:tcPr>
-            <w:tcW w:type="dxa" w:w="4873"/>
-            <w:shd w:fill="FFFFFF" w:val="clear"/>
-          </w:tcPr>
-          <w:p>
-            <w:r/>
-            <w:r>
-              <w:rPr>
-                <w:rFonts w:ascii="Calibri" w:hAnsi="Calibri" w:eastAsia="Calibri"/>
-                <w:b w:val="0"/>
-                <w:color w:val="1D1917"/>
-                <w:sz w:val="20"/>
-              </w:rPr>
-              <w:t>Base URL (desarrollo HTTP)</w:t>
+              <w:t>Ruta</w:t>
             </w:r>
           </w:p>
         </w:tc>
         <w:tc>
           <w:tcPr>
-            <w:tcW w:type="dxa" w:w="4873"/>
-            <w:shd w:fill="FFFFFF" w:val="clear"/>
-          </w:tcPr>
-          <w:p>
-            <w:r/>
-            <w:r>
-              <w:rPr>
-                <w:rFonts w:ascii="Calibri" w:hAnsi="Calibri" w:eastAsia="Calibri"/>
-                <w:b w:val="0"/>
-                <w:color w:val="1D1917"/>
-                <w:sz w:val="20"/>
-              </w:rPr>
-              <w:t>http://localhost:5141</w:t>
-            </w:r>
-          </w:p>
-        </w:tc>
-      </w:tr>
-      <w:tr>
-        <w:tc>
-          <w:tcPr>
-            <w:tcW w:type="dxa" w:w="4873"/>
-            <w:shd w:fill="F7F3EE" w:val="clear"/>
-          </w:tcPr>
-          <w:p>
-            <w:r/>
-            <w:r>
-              <w:rPr>
-                <w:rFonts w:ascii="Calibri" w:hAnsi="Calibri" w:eastAsia="Calibri"/>
-                <w:b w:val="0"/>
-                <w:color w:val="1D1917"/>
-                <w:sz w:val="20"/>
-              </w:rPr>
-              <w:t>Prefijo de versión</w:t>
-            </w:r>
-          </w:p>
-        </w:tc>
-        <w:tc>
-          <w:tcPr>
-            <w:tcW w:type="dxa" w:w="4873"/>
-            <w:shd w:fill="F7F3EE" w:val="clear"/>
-          </w:tcPr>
-          <w:p>
-            <w:r/>
-            <w:r>
-              <w:rPr>
-                <w:rFonts w:ascii="Calibri" w:hAnsi="Calibri" w:eastAsia="Calibri"/>
-                <w:b w:val="0"/>
-                <w:color w:val="1D1917"/>
-                <w:sz w:val="20"/>
-              </w:rPr>
-              <w:t>/api/v1</w:t>
-            </w:r>
-          </w:p>
-        </w:tc>
-      </w:tr>
-      <w:tr>
-        <w:tc>
-          <w:tcPr>
-            <w:tcW w:type="dxa" w:w="4873"/>
-            <w:shd w:fill="FFFFFF" w:val="clear"/>
-          </w:tcPr>
-          <w:p>
-            <w:r/>
-            <w:r>
-              <w:rPr>
-                <w:rFonts w:ascii="Calibri" w:hAnsi="Calibri" w:eastAsia="Calibri"/>
-                <w:b w:val="0"/>
-                <w:color w:val="1D1917"/>
-                <w:sz w:val="20"/>
-              </w:rPr>
-              <w:t>Formato</w:t>
-            </w:r>
-          </w:p>
-        </w:tc>
-        <w:tc>
-          <w:tcPr>
-            <w:tcW w:type="dxa" w:w="4873"/>
-            <w:shd w:fill="FFFFFF" w:val="clear"/>
-          </w:tcPr>
-          <w:p>
-            <w:r/>
-            <w:r>
-              <w:rPr>
-                <w:rFonts w:ascii="Calibri" w:hAnsi="Calibri" w:eastAsia="Calibri"/>
-                <w:b w:val="0"/>
-                <w:color w:val="1D1917"/>
-                <w:sz w:val="20"/>
-              </w:rPr>
-              <w:t>JSON (camelCase)</w:t>
-            </w:r>
-          </w:p>
-        </w:tc>
-      </w:tr>
-      <w:tr>
-        <w:tc>
-          <w:tcPr>
-            <w:tcW w:type="dxa" w:w="4873"/>
-            <w:shd w:fill="F7F3EE" w:val="clear"/>
-          </w:tcPr>
-          <w:p>
-            <w:r/>
-            <w:r>
-              <w:rPr>
-                <w:rFonts w:ascii="Calibri" w:hAnsi="Calibri" w:eastAsia="Calibri"/>
-                <w:b w:val="0"/>
-                <w:color w:val="1D1917"/>
-                <w:sz w:val="20"/>
-              </w:rPr>
-              <w:t>Autenticación</w:t>
-            </w:r>
-          </w:p>
-        </w:tc>
-        <w:tc>
-          <w:tcPr>
-            <w:tcW w:type="dxa" w:w="4873"/>
-            <w:shd w:fill="F7F3EE" w:val="clear"/>
-          </w:tcPr>
-          <w:p>
-            <w:r/>
-            <w:r>
-              <w:rPr>
-                <w:rFonts w:ascii="Calibri" w:hAnsi="Calibri" w:eastAsia="Calibri"/>
-                <w:b w:val="0"/>
-                <w:color w:val="1D1917"/>
-                <w:sz w:val="20"/>
-              </w:rPr>
-              <w:t>Ninguna en esta versión. El catálogo es de lectura pública.</w:t>
-            </w:r>
-          </w:p>
-        </w:tc>
-      </w:tr>
-      <w:tr>
-        <w:tc>
-          <w:tcPr>
-            <w:tcW w:type="dxa" w:w="4873"/>
-            <w:shd w:fill="FFFFFF" w:val="clear"/>
-          </w:tcPr>
-          <w:p>
-            <w:r/>
-            <w:r>
-              <w:rPr>
-                <w:rFonts w:ascii="Calibri" w:hAnsi="Calibri" w:eastAsia="Calibri"/>
-                <w:b w:val="0"/>
-                <w:color w:val="1D1917"/>
-                <w:sz w:val="20"/>
-              </w:rPr>
-              <w:t>HTTPS en desarrollo</w:t>
-            </w:r>
-          </w:p>
-        </w:tc>
-        <w:tc>
-          <w:tcPr>
-            <w:tcW w:type="dxa" w:w="4873"/>
-            <w:shd w:fill="FFFFFF" w:val="clear"/>
-          </w:tcPr>
-          <w:p>
-            <w:r/>
-            <w:r>
-              <w:rPr>
-                <w:rFonts w:ascii="Calibri" w:hAnsi="Calibri" w:eastAsia="Calibri"/>
-                <w:b w:val="0"/>
-                <w:color w:val="1D1917"/>
-                <w:sz w:val="20"/>
-              </w:rPr>
-              <w:t>Desactivado en el perfil de Development para no romper llamadas desde Angular en HTTP.</w:t>
-            </w:r>
-          </w:p>
-        </w:tc>
-      </w:tr>
-      <w:tr>
-        <w:tc>
-          <w:tcPr>
-            <w:tcW w:type="dxa" w:w="4873"/>
-            <w:shd w:fill="F7F3EE" w:val="clear"/>
-          </w:tcPr>
-          <w:p>
-            <w:r/>
-            <w:r>
-              <w:rPr>
-                <w:rFonts w:ascii="Calibri" w:hAnsi="Calibri" w:eastAsia="Calibri"/>
-                <w:b w:val="0"/>
-                <w:color w:val="1D1917"/>
-                <w:sz w:val="20"/>
-              </w:rPr>
-              <w:t>CORS permitido</w:t>
-            </w:r>
-          </w:p>
-        </w:tc>
-        <w:tc>
-          <w:tcPr>
-            <w:tcW w:type="dxa" w:w="4873"/>
-            <w:shd w:fill="F7F3EE" w:val="clear"/>
-          </w:tcPr>
-          <w:p>
-            <w:r/>
-            <w:r>
-              <w:rPr>
-                <w:rFonts w:ascii="Calibri" w:hAnsi="Calibri" w:eastAsia="Calibri"/>
-                <w:b w:val="0"/>
-                <w:color w:val="1D1917"/>
-                <w:sz w:val="20"/>
-              </w:rPr>
-              <w:t>http://localhost:4200 y http://127.0.0.1:4200</w:t>
-            </w:r>
-          </w:p>
-        </w:tc>
-      </w:tr>
-      <w:tr>
-        <w:tc>
-          <w:tcPr>
-            <w:tcW w:type="dxa" w:w="4873"/>
-            <w:shd w:fill="FFFFFF" w:val="clear"/>
-          </w:tcPr>
-          <w:p>
-            <w:r/>
-            <w:r>
-              <w:rPr>
-                <w:rFonts w:ascii="Calibri" w:hAnsi="Calibri" w:eastAsia="Calibri"/>
-                <w:b w:val="0"/>
-                <w:color w:val="1D1917"/>
-                <w:sz w:val="20"/>
-              </w:rPr>
-              <w:t>OpenAPI / Swagger</w:t>
-            </w:r>
-          </w:p>
-        </w:tc>
-        <w:tc>
-          <w:tcPr>
-            <w:tcW w:type="dxa" w:w="4873"/>
-            <w:shd w:fill="FFFFFF" w:val="clear"/>
-          </w:tcPr>
-          <w:p>
-            <w:r/>
-            <w:r>
-              <w:rPr>
-                <w:rFonts w:ascii="Calibri" w:hAnsi="Calibri" w:eastAsia="Calibri"/>
-                <w:b w:val="0"/>
-                <w:color w:val="1D1917"/>
-                <w:sz w:val="20"/>
-              </w:rPr>
-              <w:t>http://localhost:5141/swagger (solo Development)</w:t>
-            </w:r>
-          </w:p>
-        </w:tc>
-      </w:tr>
-    </w:tbl>
-    <w:p/>
-    <w:p>
-      <w:pPr>
-        <w:spacing w:after="160"/>
-      </w:pPr>
-      <w:r>
-        <w:rPr>
-          <w:rFonts w:ascii="Calibri" w:hAnsi="Calibri" w:eastAsia="Calibri"/>
-          <w:b w:val="0"/>
-          <w:color w:val="1D1917"/>
-          <w:sz w:val="22"/>
-        </w:rPr>
-        <w:t>En producción la API se publicará en api.dominiodelasierra.com bajo HTTPS. Este documento cubre únicamente el entorno de desarrollo actual.</w:t>
-      </w:r>
-    </w:p>
-    <w:p>
-      <w:pPr>
-        <w:pStyle w:val="Heading1"/>
-      </w:pPr>
-      <w:r>
-        <w:rPr>
-          <w:rFonts w:ascii="Calibri" w:hAnsi="Calibri"/>
-          <w:color w:val="421F25"/>
-        </w:rPr>
-        <w:t>4. Recurso: catálogo de productos</w:t>
-      </w:r>
-    </w:p>
-    <w:p>
-      <w:pPr>
-        <w:pStyle w:val="Heading2"/>
-      </w:pPr>
-      <w:r>
-        <w:rPr>
-          <w:rFonts w:ascii="Calibri" w:hAnsi="Calibri"/>
-          <w:color w:val="421F25"/>
-        </w:rPr>
-        <w:t>4.1 Operación</w:t>
-      </w:r>
-    </w:p>
-    <w:tbl>
-      <w:tblPr>
-        <w:tblStyle w:val="TableGrid"/>
-        <w:tblW w:type="auto" w:w="0"/>
-        <w:tblLayout w:type="autofit"/>
-        <w:tblLook w:firstColumn="1" w:firstRow="1" w:lastColumn="0" w:lastRow="0" w:noHBand="0" w:noVBand="1" w:val="04A0"/>
-      </w:tblPr>
-      <w:tblGrid>
-        <w:gridCol w:w="4873"/>
-        <w:gridCol w:w="4873"/>
-      </w:tblGrid>
-      <w:tr>
-        <w:tc>
-          <w:tcPr>
-            <w:tcW w:type="dxa" w:w="4873"/>
+            <w:tcW w:type="dxa" w:w="3249"/>
             <w:shd w:fill="421F25" w:val="clear"/>
           </w:tcPr>
           <w:p>
@@ -1012,25 +847,7 @@
                 <w:color w:val="FFFFFF"/>
                 <w:sz w:val="20"/>
               </w:rPr>
-              <w:t>Campo</w:t>
-            </w:r>
-          </w:p>
-        </w:tc>
-        <w:tc>
-          <w:tcPr>
-            <w:tcW w:type="dxa" w:w="4873"/>
-            <w:shd w:fill="421F25" w:val="clear"/>
-          </w:tcPr>
-          <w:p>
-            <w:r/>
-            <w:r>
-              <w:rPr>
-                <w:rFonts w:ascii="Calibri" w:hAnsi="Calibri" w:eastAsia="Calibri"/>
-                <w:b/>
-                <w:color w:val="FFFFFF"/>
-                <w:sz w:val="20"/>
-              </w:rPr>
-              <w:t>Valor</w:t>
+              <w:t>Descripción</w:t>
             </w:r>
           </w:p>
         </w:tc>
@@ -1038,25 +855,7 @@
       <w:tr>
         <w:tc>
           <w:tcPr>
-            <w:tcW w:type="dxa" w:w="4873"/>
-            <w:shd w:fill="FFFFFF" w:val="clear"/>
-          </w:tcPr>
-          <w:p>
-            <w:r/>
-            <w:r>
-              <w:rPr>
-                <w:rFonts w:ascii="Calibri" w:hAnsi="Calibri" w:eastAsia="Calibri"/>
-                <w:b w:val="0"/>
-                <w:color w:val="1D1917"/>
-                <w:sz w:val="20"/>
-              </w:rPr>
-              <w:t>Método</w:t>
-            </w:r>
-          </w:p>
-        </w:tc>
-        <w:tc>
-          <w:tcPr>
-            <w:tcW w:type="dxa" w:w="4873"/>
+            <w:tcW w:type="dxa" w:w="3249"/>
             <w:shd w:fill="FFFFFF" w:val="clear"/>
           </w:tcPr>
           <w:p>
@@ -1072,30 +871,10 @@
             </w:r>
           </w:p>
         </w:tc>
-      </w:tr>
-      <w:tr>
         <w:tc>
           <w:tcPr>
-            <w:tcW w:type="dxa" w:w="4873"/>
-            <w:shd w:fill="F7F3EE" w:val="clear"/>
-          </w:tcPr>
-          <w:p>
-            <w:r/>
-            <w:r>
-              <w:rPr>
-                <w:rFonts w:ascii="Calibri" w:hAnsi="Calibri" w:eastAsia="Calibri"/>
-                <w:b w:val="0"/>
-                <w:color w:val="1D1917"/>
-                <w:sz w:val="20"/>
-              </w:rPr>
-              <w:t>Ruta</w:t>
-            </w:r>
-          </w:p>
-        </w:tc>
-        <w:tc>
-          <w:tcPr>
-            <w:tcW w:type="dxa" w:w="4873"/>
-            <w:shd w:fill="F7F3EE" w:val="clear"/>
+            <w:tcW w:type="dxa" w:w="3249"/>
+            <w:shd w:fill="FFFFFF" w:val="clear"/>
           </w:tcPr>
           <w:p>
             <w:r/>
@@ -1110,11 +889,9 @@
             </w:r>
           </w:p>
         </w:tc>
-      </w:tr>
-      <w:tr>
         <w:tc>
           <w:tcPr>
-            <w:tcW w:type="dxa" w:w="4873"/>
+            <w:tcW w:type="dxa" w:w="3249"/>
             <w:shd w:fill="FFFFFF" w:val="clear"/>
           </w:tcPr>
           <w:p>
@@ -1126,13 +903,71 @@
                 <w:color w:val="1D1917"/>
                 <w:sz w:val="20"/>
               </w:rPr>
-              <w:t>URL completa</w:t>
+              <w:t>Listado paginado de productos activos con categoría activa.</w:t>
+            </w:r>
+          </w:p>
+        </w:tc>
+      </w:tr>
+      <w:tr>
+        <w:tc>
+          <w:tcPr>
+            <w:tcW w:type="dxa" w:w="3249"/>
+            <w:shd w:fill="F7F3EE" w:val="clear"/>
+          </w:tcPr>
+          <w:p>
+            <w:r/>
+            <w:r>
+              <w:rPr>
+                <w:rFonts w:ascii="Calibri" w:hAnsi="Calibri" w:eastAsia="Calibri"/>
+                <w:b w:val="0"/>
+                <w:color w:val="1D1917"/>
+                <w:sz w:val="20"/>
+              </w:rPr>
+              <w:t>GET</w:t>
             </w:r>
           </w:p>
         </w:tc>
         <w:tc>
           <w:tcPr>
-            <w:tcW w:type="dxa" w:w="4873"/>
+            <w:tcW w:type="dxa" w:w="3249"/>
+            <w:shd w:fill="F7F3EE" w:val="clear"/>
+          </w:tcPr>
+          <w:p>
+            <w:r/>
+            <w:r>
+              <w:rPr>
+                <w:rFonts w:ascii="Calibri" w:hAnsi="Calibri" w:eastAsia="Calibri"/>
+                <w:b w:val="0"/>
+                <w:color w:val="1D1917"/>
+                <w:sz w:val="20"/>
+              </w:rPr>
+              <w:t>/api/v1/products/{slug}</w:t>
+            </w:r>
+          </w:p>
+        </w:tc>
+        <w:tc>
+          <w:tcPr>
+            <w:tcW w:type="dxa" w:w="3249"/>
+            <w:shd w:fill="F7F3EE" w:val="clear"/>
+          </w:tcPr>
+          <w:p>
+            <w:r/>
+            <w:r>
+              <w:rPr>
+                <w:rFonts w:ascii="Calibri" w:hAnsi="Calibri" w:eastAsia="Calibri"/>
+                <w:b w:val="0"/>
+                <w:color w:val="1D1917"/>
+                <w:sz w:val="20"/>
+              </w:rPr>
+              <w:t>Ficha de un producto activo. 404 si no existe o está inactivo.</w:t>
+            </w:r>
+          </w:p>
+        </w:tc>
+      </w:tr>
+      <w:tr>
+        <w:tc>
+          <w:tcPr>
+            <w:tcW w:type="dxa" w:w="3249"/>
             <w:shd w:fill="FFFFFF" w:val="clear"/>
           </w:tcPr>
           <w:p>
@@ -1144,16 +979,14 @@
                 <w:color w:val="1D1917"/>
                 <w:sz w:val="20"/>
               </w:rPr>
-              <w:t>http://localhost:5141/api/v1/products</w:t>
+              <w:t>GET</w:t>
             </w:r>
           </w:p>
         </w:tc>
-      </w:tr>
-      <w:tr>
         <w:tc>
           <w:tcPr>
-            <w:tcW w:type="dxa" w:w="4873"/>
-            <w:shd w:fill="F7F3EE" w:val="clear"/>
+            <w:tcW w:type="dxa" w:w="3249"/>
+            <w:shd w:fill="FFFFFF" w:val="clear"/>
           </w:tcPr>
           <w:p>
             <w:r/>
@@ -1164,14 +997,14 @@
                 <w:color w:val="1D1917"/>
                 <w:sz w:val="20"/>
               </w:rPr>
-              <w:t>Descripción</w:t>
+              <w:t>/api/v1/categories</w:t>
             </w:r>
           </w:p>
         </w:tc>
         <w:tc>
           <w:tcPr>
-            <w:tcW w:type="dxa" w:w="4873"/>
-            <w:shd w:fill="F7F3EE" w:val="clear"/>
+            <w:tcW w:type="dxa" w:w="3249"/>
+            <w:shd w:fill="FFFFFF" w:val="clear"/>
           </w:tcPr>
           <w:p>
             <w:r/>
@@ -1182,7 +1015,7 @@
                 <w:color w:val="1D1917"/>
                 <w:sz w:val="20"/>
               </w:rPr>
-              <w:t>Lista paginada de productos activos cuya categoría también está activa.</w:t>
+              <w:t>Categorías activas (id, name, slug, parentCategoryId).</w:t>
             </w:r>
           </w:p>
         </w:tc>
@@ -1198,28 +1031,13 @@
           <w:rFonts w:ascii="Calibri" w:hAnsi="Calibri"/>
           <w:color w:val="421F25"/>
         </w:rPr>
-        <w:t>4.2 Parámetros de consulta</w:t>
-      </w:r>
-    </w:p>
-    <w:p>
-      <w:pPr>
-        <w:spacing w:after="160"/>
-      </w:pPr>
-      <w:r>
-        <w:rPr>
-          <w:rFonts w:ascii="Calibri" w:hAnsi="Calibri" w:eastAsia="Calibri"/>
-          <w:b w:val="0"/>
-          <w:color w:val="1D1917"/>
-          <w:sz w:val="22"/>
-        </w:rPr>
-        <w:t>Todos son opcionales. Se envían en la query string.</w:t>
+        <w:t>3.1 GET /api/v1/products</w:t>
       </w:r>
     </w:p>
     <w:tbl>
       <w:tblPr>
         <w:tblStyle w:val="TableGrid"/>
         <w:tblW w:type="auto" w:w="0"/>
-        <w:tblLayout w:type="autofit"/>
         <w:tblLook w:firstColumn="1" w:firstRow="1" w:lastColumn="0" w:lastRow="0" w:noHBand="0" w:noVBand="1" w:val="04A0"/>
       </w:tblPr>
       <w:tblGrid>
@@ -1371,7 +1189,7 @@
                 <w:color w:val="1D1917"/>
                 <w:sz w:val="20"/>
               </w:rPr>
-              <w:t>Debe ser ≥ 1.</w:t>
+              <w:t>≥ 1</w:t>
             </w:r>
           </w:p>
         </w:tc>
@@ -1445,7 +1263,7 @@
                 <w:color w:val="1D1917"/>
                 <w:sz w:val="20"/>
               </w:rPr>
-              <w:t>Entre 1 y 100 (inclusive).</w:t>
+              <w:t>Entre 1 y 100</w:t>
             </w:r>
           </w:p>
         </w:tc>
@@ -1519,7 +1337,7 @@
                 <w:color w:val="1D1917"/>
                 <w:sz w:val="20"/>
               </w:rPr>
-              <w:t>Búsqueda insensible a mayúsculas sobre Name, Reference y Slug (PostgreSQL ILIKE).</w:t>
+              <w:t>ILIKE sobre Name, Reference y Slug</w:t>
             </w:r>
           </w:p>
         </w:tc>
@@ -1593,7 +1411,7 @@
                 <w:color w:val="1D1917"/>
                 <w:sz w:val="20"/>
               </w:rPr>
-              <w:t>Slug de categoría, por ejemplo tintos. No es el UUID.</w:t>
+              <w:t>Slug de categoría (ej. tintos), no el UUID</w:t>
             </w:r>
           </w:p>
         </w:tc>
@@ -1613,7 +1431,7 @@
                 <w:color w:val="1D1917"/>
                 <w:sz w:val="20"/>
               </w:rPr>
-              <w:t>minPrice</w:t>
+              <w:t>minPrice / maxPrice</w:t>
             </w:r>
           </w:p>
         </w:tc>
@@ -1667,113 +1485,13 @@
                 <w:color w:val="1D1917"/>
                 <w:sz w:val="20"/>
               </w:rPr>
-              <w:t>Precio mínimo inclusive. No negativo.</w:t>
-            </w:r>
-          </w:p>
-        </w:tc>
-      </w:tr>
-      <w:tr>
-        <w:tc>
-          <w:tcPr>
-            <w:tcW w:type="dxa" w:w="2436"/>
-            <w:shd w:fill="F7F3EE" w:val="clear"/>
-          </w:tcPr>
-          <w:p>
-            <w:r/>
-            <w:r>
-              <w:rPr>
-                <w:rFonts w:ascii="Calibri" w:hAnsi="Calibri" w:eastAsia="Calibri"/>
-                <w:b w:val="0"/>
-                <w:color w:val="1D1917"/>
-                <w:sz w:val="20"/>
-              </w:rPr>
-              <w:t>maxPrice</w:t>
-            </w:r>
-          </w:p>
-        </w:tc>
-        <w:tc>
-          <w:tcPr>
-            <w:tcW w:type="dxa" w:w="2436"/>
-            <w:shd w:fill="F7F3EE" w:val="clear"/>
-          </w:tcPr>
-          <w:p>
-            <w:r/>
-            <w:r>
-              <w:rPr>
-                <w:rFonts w:ascii="Calibri" w:hAnsi="Calibri" w:eastAsia="Calibri"/>
-                <w:b w:val="0"/>
-                <w:color w:val="1D1917"/>
-                <w:sz w:val="20"/>
-              </w:rPr>
-              <w:t>decimal</w:t>
-            </w:r>
-          </w:p>
-        </w:tc>
-        <w:tc>
-          <w:tcPr>
-            <w:tcW w:type="dxa" w:w="2436"/>
-            <w:shd w:fill="F7F3EE" w:val="clear"/>
-          </w:tcPr>
-          <w:p>
-            <w:r/>
-            <w:r>
-              <w:rPr>
-                <w:rFonts w:ascii="Calibri" w:hAnsi="Calibri" w:eastAsia="Calibri"/>
-                <w:b w:val="0"/>
-                <w:color w:val="1D1917"/>
-                <w:sz w:val="20"/>
-              </w:rPr>
-              <w:t>—</w:t>
-            </w:r>
-          </w:p>
-        </w:tc>
-        <w:tc>
-          <w:tcPr>
-            <w:tcW w:type="dxa" w:w="2436"/>
-            <w:shd w:fill="F7F3EE" w:val="clear"/>
-          </w:tcPr>
-          <w:p>
-            <w:r/>
-            <w:r>
-              <w:rPr>
-                <w:rFonts w:ascii="Calibri" w:hAnsi="Calibri" w:eastAsia="Calibri"/>
-                <w:b w:val="0"/>
-                <w:color w:val="1D1917"/>
-                <w:sz w:val="20"/>
-              </w:rPr>
-              <w:t>Precio máximo inclusive. No negativo. No puede ser menor que minPrice.</w:t>
+              <w:t>No negativos; minPrice ≤ maxPrice</w:t>
             </w:r>
           </w:p>
         </w:tc>
       </w:tr>
     </w:tbl>
     <w:p/>
-    <w:p>
-      <w:pPr>
-        <w:pStyle w:val="Heading2"/>
-      </w:pPr>
-      <w:r>
-        <w:rPr>
-          <w:rFonts w:ascii="Calibri" w:hAnsi="Calibri"/>
-          <w:color w:val="421F25"/>
-        </w:rPr>
-        <w:t>4.3 Ejemplos de petición</w:t>
-      </w:r>
-    </w:p>
-    <w:p>
-      <w:pPr>
-        <w:spacing w:after="160"/>
-      </w:pPr>
-      <w:r>
-        <w:rPr>
-          <w:rFonts w:ascii="Calibri" w:hAnsi="Calibri" w:eastAsia="Calibri"/>
-          <w:b w:val="0"/>
-          <w:color w:val="1D1917"/>
-          <w:sz w:val="22"/>
-        </w:rPr>
-        <w:t>Listado estándar (24 ítems por página):</w:t>
-      </w:r>
-    </w:p>
     <w:p>
       <w:pPr>
         <w:spacing w:after="200"/>
@@ -1787,20 +1505,6 @@
           <w:sz w:val="19"/>
         </w:rPr>
         <w:t>GET http://localhost:5141/api/v1/products?page=1&amp;pageSize=24</w:t>
-      </w:r>
-    </w:p>
-    <w:p>
-      <w:pPr>
-        <w:spacing w:after="160"/>
-      </w:pPr>
-      <w:r>
-        <w:rPr>
-          <w:rFonts w:ascii="Calibri" w:hAnsi="Calibri" w:eastAsia="Calibri"/>
-          <w:b w:val="0"/>
-          <w:color w:val="1D1917"/>
-          <w:sz w:val="22"/>
-        </w:rPr>
-        <w:t>Búsqueda:</w:t>
       </w:r>
     </w:p>
     <w:p>
@@ -1820,20 +1524,6 @@
     </w:p>
     <w:p>
       <w:pPr>
-        <w:spacing w:after="160"/>
-      </w:pPr>
-      <w:r>
-        <w:rPr>
-          <w:rFonts w:ascii="Calibri" w:hAnsi="Calibri" w:eastAsia="Calibri"/>
-          <w:b w:val="0"/>
-          <w:color w:val="1D1917"/>
-          <w:sz w:val="22"/>
-        </w:rPr>
-        <w:t>Filtro por categoría:</w:t>
-      </w:r>
-    </w:p>
-    <w:p>
-      <w:pPr>
         <w:spacing w:after="200"/>
         <w:ind w:left="283"/>
       </w:pPr>
@@ -1844,7 +1534,7 @@
           <w:color w:val="1D1917"/>
           <w:sz w:val="19"/>
         </w:rPr>
-        <w:t>GET http://localhost:5141/api/v1/products?category=tintos</w:t>
+        <w:t>GET http://localhost:5141/api/v1/products?category=tintos&amp;minPrice=10&amp;maxPrice=30</w:t>
       </w:r>
     </w:p>
     <w:p>
@@ -1858,77 +1548,7 @@
           <w:color w:val="1D1917"/>
           <w:sz w:val="22"/>
         </w:rPr>
-        <w:t>Rango de precio:</w:t>
-      </w:r>
-    </w:p>
-    <w:p>
-      <w:pPr>
-        <w:spacing w:after="200"/>
-        <w:ind w:left="283"/>
-      </w:pPr>
-      <w:r>
-        <w:rPr>
-          <w:rFonts w:ascii="Consolas" w:hAnsi="Consolas" w:eastAsia="Consolas"/>
-          <w:b w:val="0"/>
-          <w:color w:val="1D1917"/>
-          <w:sz w:val="19"/>
-        </w:rPr>
-        <w:t>GET http://localhost:5141/api/v1/products?minPrice=10&amp;maxPrice=30</w:t>
-      </w:r>
-    </w:p>
-    <w:p>
-      <w:pPr>
-        <w:spacing w:after="160"/>
-      </w:pPr>
-      <w:r>
-        <w:rPr>
-          <w:rFonts w:ascii="Calibri" w:hAnsi="Calibri" w:eastAsia="Calibri"/>
-          <w:b w:val="0"/>
-          <w:color w:val="1D1917"/>
-          <w:sz w:val="22"/>
-        </w:rPr>
-        <w:t>Combinado:</w:t>
-      </w:r>
-    </w:p>
-    <w:p>
-      <w:pPr>
-        <w:spacing w:after="200"/>
-        <w:ind w:left="283"/>
-      </w:pPr>
-      <w:r>
-        <w:rPr>
-          <w:rFonts w:ascii="Consolas" w:hAnsi="Consolas" w:eastAsia="Consolas"/>
-          <w:b w:val="0"/>
-          <w:color w:val="1D1917"/>
-          <w:sz w:val="19"/>
-        </w:rPr>
-        <w:t>GET http://localhost:5141/api/v1/products?page=1&amp;pageSize=24&amp;category=tintos&amp;minPrice=10</w:t>
-      </w:r>
-    </w:p>
-    <w:p>
-      <w:pPr>
-        <w:pStyle w:val="Heading2"/>
-      </w:pPr>
-      <w:r>
-        <w:rPr>
-          <w:rFonts w:ascii="Calibri" w:hAnsi="Calibri"/>
-          <w:color w:val="421F25"/>
-        </w:rPr>
-        <w:t>4.4 Respuesta 200 OK</w:t>
-      </w:r>
-    </w:p>
-    <w:p>
-      <w:pPr>
-        <w:spacing w:after="160"/>
-      </w:pPr>
-      <w:r>
-        <w:rPr>
-          <w:rFonts w:ascii="Calibri" w:hAnsi="Calibri" w:eastAsia="Calibri"/>
-          <w:b w:val="0"/>
-          <w:color w:val="1D1917"/>
-          <w:sz w:val="22"/>
-        </w:rPr>
-        <w:t>Cuerpo JSON:</w:t>
+        <w:t>Respuesta 200:</w:t>
       </w:r>
     </w:p>
     <w:p>
@@ -1945,61 +1565,89 @@
         </w:rPr>
         <w:t>{</w:t>
         <w:br/>
-        <w:t xml:space="preserve">  "items": [</w:t>
+        <w:t xml:space="preserve">  "items": [ { "id": "...", "reference": "CRZ-001", "name": "Vino Crianza",</w:t>
         <w:br/>
-        <w:t xml:space="preserve">    {</w:t>
+        <w:t xml:space="preserve">               "slug": "vino-crianza", "description": "...", "price": 18.90,</w:t>
         <w:br/>
-        <w:t xml:space="preserve">      "id": "22222222-2222-2222-2222-222222222222",</w:t>
+        <w:t xml:space="preserve">               "vatRate": 21.00, "categoryId": "...", "categoryName": "Tintos",</w:t>
         <w:br/>
-        <w:t xml:space="preserve">      "reference": "CRZ-001",</w:t>
+        <w:t xml:space="preserve">               "categorySlug": "tintos" } ],</w:t>
         <w:br/>
-        <w:t xml:space="preserve">      "name": "Vino Crianza",</w:t>
-        <w:br/>
-        <w:t xml:space="preserve">      "slug": "vino-crianza",</w:t>
-        <w:br/>
-        <w:t xml:space="preserve">      "description": "Crianza de prueba para el catálogo.",</w:t>
-        <w:br/>
-        <w:t xml:space="preserve">      "price": 18.90,</w:t>
-        <w:br/>
-        <w:t xml:space="preserve">      "vatRate": 21.00,</w:t>
-        <w:br/>
-        <w:t xml:space="preserve">      "categoryId": "11111111-1111-1111-1111-111111111111",</w:t>
-        <w:br/>
-        <w:t xml:space="preserve">      "categoryName": "Tintos",</w:t>
-        <w:br/>
-        <w:t xml:space="preserve">      "categorySlug": "tintos"</w:t>
-        <w:br/>
-        <w:t xml:space="preserve">    }</w:t>
-        <w:br/>
-        <w:t xml:space="preserve">  ],</w:t>
-        <w:br/>
-        <w:t xml:space="preserve">  "page": 1,</w:t>
-        <w:br/>
-        <w:t xml:space="preserve">  "pageSize": 24,</w:t>
-        <w:br/>
-        <w:t xml:space="preserve">  "totalItems": 1,</w:t>
-        <w:br/>
-        <w:t xml:space="preserve">  "totalPages": 1</w:t>
+        <w:t xml:space="preserve">  "page": 1, "pageSize": 24, "totalItems": 2, "totalPages": 1</w:t>
         <w:br/>
         <w:t>}</w:t>
+      </w:r>
+    </w:p>
+    <w:p>
+      <w:pPr>
+        <w:pStyle w:val="Heading2"/>
+      </w:pPr>
+      <w:r>
+        <w:rPr>
+          <w:rFonts w:ascii="Calibri" w:hAnsi="Calibri"/>
+          <w:color w:val="421F25"/>
+        </w:rPr>
+        <w:t>3.2 GET /api/v1/products/{slug}</w:t>
+      </w:r>
+    </w:p>
+    <w:p>
+      <w:pPr>
+        <w:spacing w:after="160"/>
+      </w:pPr>
+      <w:r>
+        <w:rPr>
+          <w:rFonts w:ascii="Calibri" w:hAnsi="Calibri" w:eastAsia="Calibri"/>
+          <w:b w:val="0"/>
+          <w:color w:val="1D1917"/>
+          <w:sz w:val="22"/>
+        </w:rPr>
+        <w:t>Devuelve el mismo DTO de ítem (sin paginación). Angular usa esta ruta en /vinos/{slug}.</w:t>
+      </w:r>
+    </w:p>
+    <w:p>
+      <w:pPr>
+        <w:spacing w:after="200"/>
+        <w:ind w:left="283"/>
+      </w:pPr>
+      <w:r>
+        <w:rPr>
+          <w:rFonts w:ascii="Consolas" w:hAnsi="Consolas" w:eastAsia="Consolas"/>
+          <w:b w:val="0"/>
+          <w:color w:val="1D1917"/>
+          <w:sz w:val="19"/>
+        </w:rPr>
+        <w:t>GET http://localhost:5141/api/v1/products/vino-crianza</w:t>
+      </w:r>
+    </w:p>
+    <w:p>
+      <w:pPr>
+        <w:spacing w:after="200"/>
+        <w:ind w:left="283"/>
+      </w:pPr>
+      <w:r>
+        <w:rPr>
+          <w:rFonts w:ascii="Consolas" w:hAnsi="Consolas" w:eastAsia="Consolas"/>
+          <w:b w:val="0"/>
+          <w:color w:val="1D1917"/>
+          <w:sz w:val="19"/>
+        </w:rPr>
+        <w:t>GET http://localhost:5141/api/v1/products/blanco-de-sierra</w:t>
       </w:r>
     </w:p>
     <w:tbl>
       <w:tblPr>
         <w:tblStyle w:val="TableGrid"/>
         <w:tblW w:type="auto" w:w="0"/>
-        <w:tblLayout w:type="autofit"/>
         <w:tblLook w:firstColumn="1" w:firstRow="1" w:lastColumn="0" w:lastRow="0" w:noHBand="0" w:noVBand="1" w:val="04A0"/>
       </w:tblPr>
       <w:tblGrid>
-        <w:gridCol w:w="3249"/>
-        <w:gridCol w:w="3249"/>
-        <w:gridCol w:w="3249"/>
+        <w:gridCol w:w="4873"/>
+        <w:gridCol w:w="4873"/>
       </w:tblGrid>
       <w:tr>
         <w:tc>
           <w:tcPr>
-            <w:tcW w:type="dxa" w:w="3249"/>
+            <w:tcW w:type="dxa" w:w="4873"/>
             <w:shd w:fill="421F25" w:val="clear"/>
           </w:tcPr>
           <w:p>
@@ -2011,31 +1659,13 @@
                 <w:color w:val="FFFFFF"/>
                 <w:sz w:val="20"/>
               </w:rPr>
-              <w:t>Campo</w:t>
+              <w:t>HTTP</w:t>
             </w:r>
           </w:p>
         </w:tc>
         <w:tc>
           <w:tcPr>
-            <w:tcW w:type="dxa" w:w="3249"/>
-            <w:shd w:fill="421F25" w:val="clear"/>
-          </w:tcPr>
-          <w:p>
-            <w:r/>
-            <w:r>
-              <w:rPr>
-                <w:rFonts w:ascii="Calibri" w:hAnsi="Calibri" w:eastAsia="Calibri"/>
-                <w:b/>
-                <w:color w:val="FFFFFF"/>
-                <w:sz w:val="20"/>
-              </w:rPr>
-              <w:t>Tipo</w:t>
-            </w:r>
-          </w:p>
-        </w:tc>
-        <w:tc>
-          <w:tcPr>
-            <w:tcW w:type="dxa" w:w="3249"/>
+            <w:tcW w:type="dxa" w:w="4873"/>
             <w:shd w:fill="421F25" w:val="clear"/>
           </w:tcPr>
           <w:p>
@@ -2055,7 +1685,7 @@
       <w:tr>
         <w:tc>
           <w:tcPr>
-            <w:tcW w:type="dxa" w:w="3249"/>
+            <w:tcW w:type="dxa" w:w="4873"/>
             <w:shd w:fill="FFFFFF" w:val="clear"/>
           </w:tcPr>
           <w:p>
@@ -2067,13 +1697,13 @@
                 <w:color w:val="1D1917"/>
                 <w:sz w:val="20"/>
               </w:rPr>
-              <w:t>items</w:t>
+              <w:t>200</w:t>
             </w:r>
           </w:p>
         </w:tc>
         <w:tc>
           <w:tcPr>
-            <w:tcW w:type="dxa" w:w="3249"/>
+            <w:tcW w:type="dxa" w:w="4873"/>
             <w:shd w:fill="FFFFFF" w:val="clear"/>
           </w:tcPr>
           <w:p>
@@ -2085,13 +1715,53 @@
                 <w:color w:val="1D1917"/>
                 <w:sz w:val="20"/>
               </w:rPr>
-              <w:t>array</w:t>
+              <w:t>Producto activo encontrado.</w:t>
+            </w:r>
+          </w:p>
+        </w:tc>
+      </w:tr>
+      <w:tr>
+        <w:tc>
+          <w:tcPr>
+            <w:tcW w:type="dxa" w:w="4873"/>
+            <w:shd w:fill="F7F3EE" w:val="clear"/>
+          </w:tcPr>
+          <w:p>
+            <w:r/>
+            <w:r>
+              <w:rPr>
+                <w:rFonts w:ascii="Calibri" w:hAnsi="Calibri" w:eastAsia="Calibri"/>
+                <w:b w:val="0"/>
+                <w:color w:val="1D1917"/>
+                <w:sz w:val="20"/>
+              </w:rPr>
+              <w:t>400</w:t>
             </w:r>
           </w:p>
         </w:tc>
         <w:tc>
           <w:tcPr>
-            <w:tcW w:type="dxa" w:w="3249"/>
+            <w:tcW w:type="dxa" w:w="4873"/>
+            <w:shd w:fill="F7F3EE" w:val="clear"/>
+          </w:tcPr>
+          <w:p>
+            <w:r/>
+            <w:r>
+              <w:rPr>
+                <w:rFonts w:ascii="Calibri" w:hAnsi="Calibri" w:eastAsia="Calibri"/>
+                <w:b w:val="0"/>
+                <w:color w:val="1D1917"/>
+                <w:sz w:val="20"/>
+              </w:rPr>
+              <w:t>Slug vacío o no válido.</w:t>
+            </w:r>
+          </w:p>
+        </w:tc>
+      </w:tr>
+      <w:tr>
+        <w:tc>
+          <w:tcPr>
+            <w:tcW w:type="dxa" w:w="4873"/>
             <w:shd w:fill="FFFFFF" w:val="clear"/>
           </w:tcPr>
           <w:p>
@@ -2103,7 +1773,149 @@
                 <w:color w:val="1D1917"/>
                 <w:sz w:val="20"/>
               </w:rPr>
-              <w:t>Productos de la página actual. Vacío si no hay coincidencias.</w:t>
+              <w:t>404</w:t>
+            </w:r>
+          </w:p>
+        </w:tc>
+        <w:tc>
+          <w:tcPr>
+            <w:tcW w:type="dxa" w:w="4873"/>
+            <w:shd w:fill="FFFFFF" w:val="clear"/>
+          </w:tcPr>
+          <w:p>
+            <w:r/>
+            <w:r>
+              <w:rPr>
+                <w:rFonts w:ascii="Calibri" w:hAnsi="Calibri" w:eastAsia="Calibri"/>
+                <w:b w:val="0"/>
+                <w:color w:val="1D1917"/>
+                <w:sz w:val="20"/>
+              </w:rPr>
+              <w:t>{ "error": "Product not found." } — no existe, inactivo o categoría inactiva.</w:t>
+            </w:r>
+          </w:p>
+        </w:tc>
+      </w:tr>
+    </w:tbl>
+    <w:p/>
+    <w:p>
+      <w:pPr>
+        <w:pStyle w:val="Heading2"/>
+      </w:pPr>
+      <w:r>
+        <w:rPr>
+          <w:rFonts w:ascii="Calibri" w:hAnsi="Calibri"/>
+          <w:color w:val="421F25"/>
+        </w:rPr>
+        <w:t>3.3 GET /api/v1/categories</w:t>
+      </w:r>
+    </w:p>
+    <w:p>
+      <w:pPr>
+        <w:spacing w:after="160"/>
+      </w:pPr>
+      <w:r>
+        <w:rPr>
+          <w:rFonts w:ascii="Calibri" w:hAnsi="Calibri" w:eastAsia="Calibri"/>
+          <w:b w:val="0"/>
+          <w:color w:val="1D1917"/>
+          <w:sz w:val="22"/>
+        </w:rPr>
+        <w:t>Array JSON (no envuelto). Solo categorías Active = true, ordenadas por nombre.</w:t>
+      </w:r>
+    </w:p>
+    <w:p>
+      <w:pPr>
+        <w:spacing w:after="200"/>
+        <w:ind w:left="283"/>
+      </w:pPr>
+      <w:r>
+        <w:rPr>
+          <w:rFonts w:ascii="Consolas" w:hAnsi="Consolas" w:eastAsia="Consolas"/>
+          <w:b w:val="0"/>
+          <w:color w:val="1D1917"/>
+          <w:sz w:val="19"/>
+        </w:rPr>
+        <w:t>GET http://localhost:5141/api/v1/categories</w:t>
+      </w:r>
+    </w:p>
+    <w:p>
+      <w:pPr>
+        <w:spacing w:after="200"/>
+        <w:ind w:left="283"/>
+      </w:pPr>
+      <w:r>
+        <w:rPr>
+          <w:rFonts w:ascii="Consolas" w:hAnsi="Consolas" w:eastAsia="Consolas"/>
+          <w:b w:val="0"/>
+          <w:color w:val="1D1917"/>
+          <w:sz w:val="19"/>
+        </w:rPr>
+        <w:t>[</w:t>
+        <w:br/>
+        <w:t xml:space="preserve">  { "id": "11111111-1111-1111-1111-111111111111",</w:t>
+        <w:br/>
+        <w:t xml:space="preserve">    "name": "Tintos", "slug": "tintos", "parentCategoryId": null }</w:t>
+        <w:br/>
+        <w:t>]</w:t>
+      </w:r>
+    </w:p>
+    <w:p>
+      <w:pPr>
+        <w:pStyle w:val="Heading2"/>
+      </w:pPr>
+      <w:r>
+        <w:rPr>
+          <w:rFonts w:ascii="Calibri" w:hAnsi="Calibri"/>
+          <w:color w:val="421F25"/>
+        </w:rPr>
+        <w:t>3.4 Errores comunes del catálogo</w:t>
+      </w:r>
+    </w:p>
+    <w:tbl>
+      <w:tblPr>
+        <w:tblStyle w:val="TableGrid"/>
+        <w:tblW w:type="auto" w:w="0"/>
+        <w:tblLook w:firstColumn="1" w:firstRow="1" w:lastColumn="0" w:lastRow="0" w:noHBand="0" w:noVBand="1" w:val="04A0"/>
+      </w:tblPr>
+      <w:tblGrid>
+        <w:gridCol w:w="4873"/>
+        <w:gridCol w:w="4873"/>
+      </w:tblGrid>
+      <w:tr>
+        <w:tc>
+          <w:tcPr>
+            <w:tcW w:type="dxa" w:w="4873"/>
+            <w:shd w:fill="421F25" w:val="clear"/>
+          </w:tcPr>
+          <w:p>
+            <w:r/>
+            <w:r>
+              <w:rPr>
+                <w:rFonts w:ascii="Calibri" w:hAnsi="Calibri" w:eastAsia="Calibri"/>
+                <w:b/>
+                <w:color w:val="FFFFFF"/>
+                <w:sz w:val="20"/>
+              </w:rPr>
+              <w:t>HTTP</w:t>
+            </w:r>
+          </w:p>
+        </w:tc>
+        <w:tc>
+          <w:tcPr>
+            <w:tcW w:type="dxa" w:w="4873"/>
+            <w:shd w:fill="421F25" w:val="clear"/>
+          </w:tcPr>
+          <w:p>
+            <w:r/>
+            <w:r>
+              <w:rPr>
+                <w:rFonts w:ascii="Calibri" w:hAnsi="Calibri" w:eastAsia="Calibri"/>
+                <w:b/>
+                <w:color w:val="FFFFFF"/>
+                <w:sz w:val="20"/>
+              </w:rPr>
+              <w:t>Cuándo</w:t>
             </w:r>
           </w:p>
         </w:tc>
@@ -2111,7 +1923,45 @@
       <w:tr>
         <w:tc>
           <w:tcPr>
-            <w:tcW w:type="dxa" w:w="3249"/>
+            <w:tcW w:type="dxa" w:w="4873"/>
+            <w:shd w:fill="FFFFFF" w:val="clear"/>
+          </w:tcPr>
+          <w:p>
+            <w:r/>
+            <w:r>
+              <w:rPr>
+                <w:rFonts w:ascii="Calibri" w:hAnsi="Calibri" w:eastAsia="Calibri"/>
+                <w:b w:val="0"/>
+                <w:color w:val="1D1917"/>
+                <w:sz w:val="20"/>
+              </w:rPr>
+              <w:t>200 con items: []</w:t>
+            </w:r>
+          </w:p>
+        </w:tc>
+        <w:tc>
+          <w:tcPr>
+            <w:tcW w:type="dxa" w:w="4873"/>
+            <w:shd w:fill="FFFFFF" w:val="clear"/>
+          </w:tcPr>
+          <w:p>
+            <w:r/>
+            <w:r>
+              <w:rPr>
+                <w:rFonts w:ascii="Calibri" w:hAnsi="Calibri" w:eastAsia="Calibri"/>
+                <w:b w:val="0"/>
+                <w:color w:val="1D1917"/>
+                <w:sz w:val="20"/>
+              </w:rPr>
+              <w:t>Filtro sin coincidencias. No es un error.</w:t>
+            </w:r>
+          </w:p>
+        </w:tc>
+      </w:tr>
+      <w:tr>
+        <w:tc>
+          <w:tcPr>
+            <w:tcW w:type="dxa" w:w="4873"/>
             <w:shd w:fill="F7F3EE" w:val="clear"/>
           </w:tcPr>
           <w:p>
@@ -2123,13 +1973,13 @@
                 <w:color w:val="1D1917"/>
                 <w:sz w:val="20"/>
               </w:rPr>
-              <w:t>page</w:t>
+              <w:t>400</w:t>
             </w:r>
           </w:p>
         </w:tc>
         <w:tc>
           <w:tcPr>
-            <w:tcW w:type="dxa" w:w="3249"/>
+            <w:tcW w:type="dxa" w:w="4873"/>
             <w:shd w:fill="F7F3EE" w:val="clear"/>
           </w:tcPr>
           <w:p>
@@ -2141,13 +1991,53 @@
                 <w:color w:val="1D1917"/>
                 <w:sz w:val="20"/>
               </w:rPr>
-              <w:t>int</w:t>
+              <w:t>page, pageSize o precios fuera de rango.</w:t>
+            </w:r>
+          </w:p>
+        </w:tc>
+      </w:tr>
+      <w:tr>
+        <w:tc>
+          <w:tcPr>
+            <w:tcW w:type="dxa" w:w="4873"/>
+            <w:shd w:fill="FFFFFF" w:val="clear"/>
+          </w:tcPr>
+          <w:p>
+            <w:r/>
+            <w:r>
+              <w:rPr>
+                <w:rFonts w:ascii="Calibri" w:hAnsi="Calibri" w:eastAsia="Calibri"/>
+                <w:b w:val="0"/>
+                <w:color w:val="1D1917"/>
+                <w:sz w:val="20"/>
+              </w:rPr>
+              <w:t>404</w:t>
             </w:r>
           </w:p>
         </w:tc>
         <w:tc>
           <w:tcPr>
-            <w:tcW w:type="dxa" w:w="3249"/>
+            <w:tcW w:type="dxa" w:w="4873"/>
+            <w:shd w:fill="FFFFFF" w:val="clear"/>
+          </w:tcPr>
+          <w:p>
+            <w:r/>
+            <w:r>
+              <w:rPr>
+                <w:rFonts w:ascii="Calibri" w:hAnsi="Calibri" w:eastAsia="Calibri"/>
+                <w:b w:val="0"/>
+                <w:color w:val="1D1917"/>
+                <w:sz w:val="20"/>
+              </w:rPr>
+              <w:t>Solo en GET por slug.</w:t>
+            </w:r>
+          </w:p>
+        </w:tc>
+      </w:tr>
+      <w:tr>
+        <w:tc>
+          <w:tcPr>
+            <w:tcW w:type="dxa" w:w="4873"/>
             <w:shd w:fill="F7F3EE" w:val="clear"/>
           </w:tcPr>
           <w:p>
@@ -2159,7 +2049,210 @@
                 <w:color w:val="1D1917"/>
                 <w:sz w:val="20"/>
               </w:rPr>
-              <w:t>Página solicitada.</w:t>
+              <w:t>500</w:t>
+            </w:r>
+          </w:p>
+        </w:tc>
+        <w:tc>
+          <w:tcPr>
+            <w:tcW w:type="dxa" w:w="4873"/>
+            <w:shd w:fill="F7F3EE" w:val="clear"/>
+          </w:tcPr>
+          <w:p>
+            <w:r/>
+            <w:r>
+              <w:rPr>
+                <w:rFonts w:ascii="Calibri" w:hAnsi="Calibri" w:eastAsia="Calibri"/>
+                <w:b w:val="0"/>
+                <w:color w:val="1D1917"/>
+                <w:sz w:val="20"/>
+              </w:rPr>
+              <w:t>PostgreSQL caído o POSTGRES_PASSWORD no configurada.</w:t>
+            </w:r>
+          </w:p>
+        </w:tc>
+      </w:tr>
+    </w:tbl>
+    <w:p/>
+    <w:p>
+      <w:pPr>
+        <w:pStyle w:val="Heading1"/>
+      </w:pPr>
+      <w:r>
+        <w:rPr>
+          <w:rFonts w:ascii="Calibri" w:hAnsi="Calibri"/>
+          <w:color w:val="421F25"/>
+        </w:rPr>
+        <w:t>4. Panel interno de catálogo (/admin)</w:t>
+      </w:r>
+    </w:p>
+    <w:p>
+      <w:pPr>
+        <w:spacing w:after="160"/>
+      </w:pPr>
+      <w:r>
+        <w:rPr>
+          <w:rFonts w:ascii="Calibri" w:hAnsi="Calibri" w:eastAsia="Calibri"/>
+          <w:b w:val="0"/>
+          <w:color w:val="1D1917"/>
+          <w:sz w:val="22"/>
+        </w:rPr>
+        <w:t>El panel es una UI Razor Pages alojada en la API. Permite ver el contenido real de PostgreSQL y dar de alta categorías y productos sin SQL ni Swagger. No sustituye al futuro SaaS Angular de gestión.</w:t>
+      </w:r>
+    </w:p>
+    <w:p>
+      <w:pPr>
+        <w:pStyle w:val="Heading2"/>
+      </w:pPr>
+      <w:r>
+        <w:rPr>
+          <w:rFonts w:ascii="Calibri" w:hAnsi="Calibri"/>
+          <w:color w:val="421F25"/>
+        </w:rPr>
+        <w:t>4.1 Acceso</w:t>
+      </w:r>
+    </w:p>
+    <w:p>
+      <w:pPr>
+        <w:spacing w:after="200"/>
+        <w:ind w:left="283"/>
+      </w:pPr>
+      <w:r>
+        <w:rPr>
+          <w:rFonts w:ascii="Consolas" w:hAnsi="Consolas" w:eastAsia="Consolas"/>
+          <w:b w:val="0"/>
+          <w:color w:val="1D1917"/>
+          <w:sz w:val="19"/>
+        </w:rPr>
+        <w:t>http://localhost:5141/admin</w:t>
+      </w:r>
+    </w:p>
+    <w:p>
+      <w:pPr>
+        <w:spacing w:after="160"/>
+      </w:pPr>
+      <w:r>
+        <w:rPr>
+          <w:rFonts w:ascii="Calibri" w:hAnsi="Calibri" w:eastAsia="Calibri"/>
+          <w:b w:val="0"/>
+          <w:color w:val="1D1917"/>
+          <w:sz w:val="22"/>
+        </w:rPr>
+        <w:t>Condiciones:</w:t>
+      </w:r>
+    </w:p>
+    <w:p>
+      <w:pPr>
+        <w:spacing w:after="160"/>
+      </w:pPr>
+      <w:r>
+        <w:rPr>
+          <w:rFonts w:ascii="Calibri" w:hAnsi="Calibri" w:eastAsia="Calibri"/>
+          <w:b w:val="0"/>
+          <w:color w:val="1D1917"/>
+          <w:sz w:val="22"/>
+        </w:rPr>
+        <w:t>• La API debe ejecutarse con ASPNETCORE_ENVIRONMENT=Development (perfil http).</w:t>
+      </w:r>
+    </w:p>
+    <w:p>
+      <w:pPr>
+        <w:spacing w:after="160"/>
+      </w:pPr>
+      <w:r>
+        <w:rPr>
+          <w:rFonts w:ascii="Calibri" w:hAnsi="Calibri" w:eastAsia="Calibri"/>
+          <w:b w:val="0"/>
+          <w:color w:val="1D1917"/>
+          <w:sz w:val="22"/>
+        </w:rPr>
+        <w:t>• En producción /admin no se mapea (no hay autenticación todavía).</w:t>
+      </w:r>
+    </w:p>
+    <w:p>
+      <w:pPr>
+        <w:spacing w:after="160"/>
+      </w:pPr>
+      <w:r>
+        <w:rPr>
+          <w:rFonts w:ascii="Calibri" w:hAnsi="Calibri" w:eastAsia="Calibri"/>
+          <w:b w:val="0"/>
+          <w:color w:val="1D1917"/>
+          <w:sz w:val="22"/>
+        </w:rPr>
+        <w:t>• El panel escribe en la misma base dominio_sierra que consume el ecommerce.</w:t>
+      </w:r>
+    </w:p>
+    <w:p>
+      <w:pPr>
+        <w:pStyle w:val="Heading2"/>
+      </w:pPr>
+      <w:r>
+        <w:rPr>
+          <w:rFonts w:ascii="Calibri" w:hAnsi="Calibri"/>
+          <w:color w:val="421F25"/>
+        </w:rPr>
+        <w:t>4.2 Qué se ve</w:t>
+      </w:r>
+    </w:p>
+    <w:p>
+      <w:pPr>
+        <w:spacing w:after="160"/>
+      </w:pPr>
+      <w:r>
+        <w:rPr>
+          <w:rFonts w:ascii="Calibri" w:hAnsi="Calibri" w:eastAsia="Calibri"/>
+          <w:b w:val="0"/>
+          <w:color w:val="1D1917"/>
+          <w:sz w:val="22"/>
+        </w:rPr>
+        <w:t>Tablas inferiores (lectura de PostgreSQL, incluidos inactivos):</w:t>
+      </w:r>
+    </w:p>
+    <w:tbl>
+      <w:tblPr>
+        <w:tblStyle w:val="TableGrid"/>
+        <w:tblW w:type="auto" w:w="0"/>
+        <w:tblLook w:firstColumn="1" w:firstRow="1" w:lastColumn="0" w:lastRow="0" w:noHBand="0" w:noVBand="1" w:val="04A0"/>
+      </w:tblPr>
+      <w:tblGrid>
+        <w:gridCol w:w="4873"/>
+        <w:gridCol w:w="4873"/>
+      </w:tblGrid>
+      <w:tr>
+        <w:tc>
+          <w:tcPr>
+            <w:tcW w:type="dxa" w:w="4873"/>
+            <w:shd w:fill="421F25" w:val="clear"/>
+          </w:tcPr>
+          <w:p>
+            <w:r/>
+            <w:r>
+              <w:rPr>
+                <w:rFonts w:ascii="Calibri" w:hAnsi="Calibri" w:eastAsia="Calibri"/>
+                <w:b/>
+                <w:color w:val="FFFFFF"/>
+                <w:sz w:val="20"/>
+              </w:rPr>
+              <w:t>Bloque</w:t>
+            </w:r>
+          </w:p>
+        </w:tc>
+        <w:tc>
+          <w:tcPr>
+            <w:tcW w:type="dxa" w:w="4873"/>
+            <w:shd w:fill="421F25" w:val="clear"/>
+          </w:tcPr>
+          <w:p>
+            <w:r/>
+            <w:r>
+              <w:rPr>
+                <w:rFonts w:ascii="Calibri" w:hAnsi="Calibri" w:eastAsia="Calibri"/>
+                <w:b/>
+                <w:color w:val="FFFFFF"/>
+                <w:sz w:val="20"/>
+              </w:rPr>
+              <w:t>Campos</w:t>
             </w:r>
           </w:p>
         </w:tc>
@@ -2167,7 +2260,7 @@
       <w:tr>
         <w:tc>
           <w:tcPr>
-            <w:tcW w:type="dxa" w:w="3249"/>
+            <w:tcW w:type="dxa" w:w="4873"/>
             <w:shd w:fill="FFFFFF" w:val="clear"/>
           </w:tcPr>
           <w:p>
@@ -2179,13 +2272,13 @@
                 <w:color w:val="1D1917"/>
                 <w:sz w:val="20"/>
               </w:rPr>
-              <w:t>pageSize</w:t>
+              <w:t>Categorías</w:t>
             </w:r>
           </w:p>
         </w:tc>
         <w:tc>
           <w:tcPr>
-            <w:tcW w:type="dxa" w:w="3249"/>
+            <w:tcW w:type="dxa" w:w="4873"/>
             <w:shd w:fill="FFFFFF" w:val="clear"/>
           </w:tcPr>
           <w:p>
@@ -2197,25 +2290,7 @@
                 <w:color w:val="1D1917"/>
                 <w:sz w:val="20"/>
               </w:rPr>
-              <w:t>int</w:t>
-            </w:r>
-          </w:p>
-        </w:tc>
-        <w:tc>
-          <w:tcPr>
-            <w:tcW w:type="dxa" w:w="3249"/>
-            <w:shd w:fill="FFFFFF" w:val="clear"/>
-          </w:tcPr>
-          <w:p>
-            <w:r/>
-            <w:r>
-              <w:rPr>
-                <w:rFonts w:ascii="Calibri" w:hAnsi="Calibri" w:eastAsia="Calibri"/>
-                <w:b w:val="0"/>
-                <w:color w:val="1D1917"/>
-                <w:sz w:val="20"/>
-              </w:rPr>
-              <w:t>Tamaño de página aplicado.</w:t>
+              <w:t>Nombre, slug, padre, activa/inactiva.</w:t>
             </w:r>
           </w:p>
         </w:tc>
@@ -2223,7 +2298,7 @@
       <w:tr>
         <w:tc>
           <w:tcPr>
-            <w:tcW w:type="dxa" w:w="3249"/>
+            <w:tcW w:type="dxa" w:w="4873"/>
             <w:shd w:fill="F7F3EE" w:val="clear"/>
           </w:tcPr>
           <w:p>
@@ -2235,13 +2310,13 @@
                 <w:color w:val="1D1917"/>
                 <w:sz w:val="20"/>
               </w:rPr>
-              <w:t>totalItems</w:t>
+              <w:t>Productos</w:t>
             </w:r>
           </w:p>
         </w:tc>
         <w:tc>
           <w:tcPr>
-            <w:tcW w:type="dxa" w:w="3249"/>
+            <w:tcW w:type="dxa" w:w="4873"/>
             <w:shd w:fill="F7F3EE" w:val="clear"/>
           </w:tcPr>
           <w:p>
@@ -2253,641 +2328,7 @@
                 <w:color w:val="1D1917"/>
                 <w:sz w:val="20"/>
               </w:rPr>
-              <w:t>int</w:t>
-            </w:r>
-          </w:p>
-        </w:tc>
-        <w:tc>
-          <w:tcPr>
-            <w:tcW w:type="dxa" w:w="3249"/>
-            <w:shd w:fill="F7F3EE" w:val="clear"/>
-          </w:tcPr>
-          <w:p>
-            <w:r/>
-            <w:r>
-              <w:rPr>
-                <w:rFonts w:ascii="Calibri" w:hAnsi="Calibri" w:eastAsia="Calibri"/>
-                <w:b w:val="0"/>
-                <w:color w:val="1D1917"/>
-                <w:sz w:val="20"/>
-              </w:rPr>
-              <w:t>Total de coincidencias en PostgreSQL (no solo la página).</w:t>
-            </w:r>
-          </w:p>
-        </w:tc>
-      </w:tr>
-      <w:tr>
-        <w:tc>
-          <w:tcPr>
-            <w:tcW w:type="dxa" w:w="3249"/>
-            <w:shd w:fill="FFFFFF" w:val="clear"/>
-          </w:tcPr>
-          <w:p>
-            <w:r/>
-            <w:r>
-              <w:rPr>
-                <w:rFonts w:ascii="Calibri" w:hAnsi="Calibri" w:eastAsia="Calibri"/>
-                <w:b w:val="0"/>
-                <w:color w:val="1D1917"/>
-                <w:sz w:val="20"/>
-              </w:rPr>
-              <w:t>totalPages</w:t>
-            </w:r>
-          </w:p>
-        </w:tc>
-        <w:tc>
-          <w:tcPr>
-            <w:tcW w:type="dxa" w:w="3249"/>
-            <w:shd w:fill="FFFFFF" w:val="clear"/>
-          </w:tcPr>
-          <w:p>
-            <w:r/>
-            <w:r>
-              <w:rPr>
-                <w:rFonts w:ascii="Calibri" w:hAnsi="Calibri" w:eastAsia="Calibri"/>
-                <w:b w:val="0"/>
-                <w:color w:val="1D1917"/>
-                <w:sz w:val="20"/>
-              </w:rPr>
-              <w:t>int</w:t>
-            </w:r>
-          </w:p>
-        </w:tc>
-        <w:tc>
-          <w:tcPr>
-            <w:tcW w:type="dxa" w:w="3249"/>
-            <w:shd w:fill="FFFFFF" w:val="clear"/>
-          </w:tcPr>
-          <w:p>
-            <w:r/>
-            <w:r>
-              <w:rPr>
-                <w:rFonts w:ascii="Calibri" w:hAnsi="Calibri" w:eastAsia="Calibri"/>
-                <w:b w:val="0"/>
-                <w:color w:val="1D1917"/>
-                <w:sz w:val="20"/>
-              </w:rPr>
-              <w:t>Número de páginas. 0 si totalItems es 0.</w:t>
-            </w:r>
-          </w:p>
-        </w:tc>
-      </w:tr>
-      <w:tr>
-        <w:tc>
-          <w:tcPr>
-            <w:tcW w:type="dxa" w:w="3249"/>
-            <w:shd w:fill="F7F3EE" w:val="clear"/>
-          </w:tcPr>
-          <w:p>
-            <w:r/>
-            <w:r>
-              <w:rPr>
-                <w:rFonts w:ascii="Calibri" w:hAnsi="Calibri" w:eastAsia="Calibri"/>
-                <w:b w:val="0"/>
-                <w:color w:val="1D1917"/>
-                <w:sz w:val="20"/>
-              </w:rPr>
-              <w:t>items[].id</w:t>
-            </w:r>
-          </w:p>
-        </w:tc>
-        <w:tc>
-          <w:tcPr>
-            <w:tcW w:type="dxa" w:w="3249"/>
-            <w:shd w:fill="F7F3EE" w:val="clear"/>
-          </w:tcPr>
-          <w:p>
-            <w:r/>
-            <w:r>
-              <w:rPr>
-                <w:rFonts w:ascii="Calibri" w:hAnsi="Calibri" w:eastAsia="Calibri"/>
-                <w:b w:val="0"/>
-                <w:color w:val="1D1917"/>
-                <w:sz w:val="20"/>
-              </w:rPr>
-              <w:t>uuid</w:t>
-            </w:r>
-          </w:p>
-        </w:tc>
-        <w:tc>
-          <w:tcPr>
-            <w:tcW w:type="dxa" w:w="3249"/>
-            <w:shd w:fill="F7F3EE" w:val="clear"/>
-          </w:tcPr>
-          <w:p>
-            <w:r/>
-            <w:r>
-              <w:rPr>
-                <w:rFonts w:ascii="Calibri" w:hAnsi="Calibri" w:eastAsia="Calibri"/>
-                <w:b w:val="0"/>
-                <w:color w:val="1D1917"/>
-                <w:sz w:val="20"/>
-              </w:rPr>
-              <w:t>Identificador del producto.</w:t>
-            </w:r>
-          </w:p>
-        </w:tc>
-      </w:tr>
-      <w:tr>
-        <w:tc>
-          <w:tcPr>
-            <w:tcW w:type="dxa" w:w="3249"/>
-            <w:shd w:fill="FFFFFF" w:val="clear"/>
-          </w:tcPr>
-          <w:p>
-            <w:r/>
-            <w:r>
-              <w:rPr>
-                <w:rFonts w:ascii="Calibri" w:hAnsi="Calibri" w:eastAsia="Calibri"/>
-                <w:b w:val="0"/>
-                <w:color w:val="1D1917"/>
-                <w:sz w:val="20"/>
-              </w:rPr>
-              <w:t>items[].reference</w:t>
-            </w:r>
-          </w:p>
-        </w:tc>
-        <w:tc>
-          <w:tcPr>
-            <w:tcW w:type="dxa" w:w="3249"/>
-            <w:shd w:fill="FFFFFF" w:val="clear"/>
-          </w:tcPr>
-          <w:p>
-            <w:r/>
-            <w:r>
-              <w:rPr>
-                <w:rFonts w:ascii="Calibri" w:hAnsi="Calibri" w:eastAsia="Calibri"/>
-                <w:b w:val="0"/>
-                <w:color w:val="1D1917"/>
-                <w:sz w:val="20"/>
-              </w:rPr>
-              <w:t>string</w:t>
-            </w:r>
-          </w:p>
-        </w:tc>
-        <w:tc>
-          <w:tcPr>
-            <w:tcW w:type="dxa" w:w="3249"/>
-            <w:shd w:fill="FFFFFF" w:val="clear"/>
-          </w:tcPr>
-          <w:p>
-            <w:r/>
-            <w:r>
-              <w:rPr>
-                <w:rFonts w:ascii="Calibri" w:hAnsi="Calibri" w:eastAsia="Calibri"/>
-                <w:b w:val="0"/>
-                <w:color w:val="1D1917"/>
-                <w:sz w:val="20"/>
-              </w:rPr>
-              <w:t>Referencia única de bodega.</w:t>
-            </w:r>
-          </w:p>
-        </w:tc>
-      </w:tr>
-      <w:tr>
-        <w:tc>
-          <w:tcPr>
-            <w:tcW w:type="dxa" w:w="3249"/>
-            <w:shd w:fill="F7F3EE" w:val="clear"/>
-          </w:tcPr>
-          <w:p>
-            <w:r/>
-            <w:r>
-              <w:rPr>
-                <w:rFonts w:ascii="Calibri" w:hAnsi="Calibri" w:eastAsia="Calibri"/>
-                <w:b w:val="0"/>
-                <w:color w:val="1D1917"/>
-                <w:sz w:val="20"/>
-              </w:rPr>
-              <w:t>items[].name</w:t>
-            </w:r>
-          </w:p>
-        </w:tc>
-        <w:tc>
-          <w:tcPr>
-            <w:tcW w:type="dxa" w:w="3249"/>
-            <w:shd w:fill="F7F3EE" w:val="clear"/>
-          </w:tcPr>
-          <w:p>
-            <w:r/>
-            <w:r>
-              <w:rPr>
-                <w:rFonts w:ascii="Calibri" w:hAnsi="Calibri" w:eastAsia="Calibri"/>
-                <w:b w:val="0"/>
-                <w:color w:val="1D1917"/>
-                <w:sz w:val="20"/>
-              </w:rPr>
-              <w:t>string</w:t>
-            </w:r>
-          </w:p>
-        </w:tc>
-        <w:tc>
-          <w:tcPr>
-            <w:tcW w:type="dxa" w:w="3249"/>
-            <w:shd w:fill="F7F3EE" w:val="clear"/>
-          </w:tcPr>
-          <w:p>
-            <w:r/>
-            <w:r>
-              <w:rPr>
-                <w:rFonts w:ascii="Calibri" w:hAnsi="Calibri" w:eastAsia="Calibri"/>
-                <w:b w:val="0"/>
-                <w:color w:val="1D1917"/>
-                <w:sz w:val="20"/>
-              </w:rPr>
-              <w:t>Nombre comercial.</w:t>
-            </w:r>
-          </w:p>
-        </w:tc>
-      </w:tr>
-      <w:tr>
-        <w:tc>
-          <w:tcPr>
-            <w:tcW w:type="dxa" w:w="3249"/>
-            <w:shd w:fill="FFFFFF" w:val="clear"/>
-          </w:tcPr>
-          <w:p>
-            <w:r/>
-            <w:r>
-              <w:rPr>
-                <w:rFonts w:ascii="Calibri" w:hAnsi="Calibri" w:eastAsia="Calibri"/>
-                <w:b w:val="0"/>
-                <w:color w:val="1D1917"/>
-                <w:sz w:val="20"/>
-              </w:rPr>
-              <w:t>items[].slug</w:t>
-            </w:r>
-          </w:p>
-        </w:tc>
-        <w:tc>
-          <w:tcPr>
-            <w:tcW w:type="dxa" w:w="3249"/>
-            <w:shd w:fill="FFFFFF" w:val="clear"/>
-          </w:tcPr>
-          <w:p>
-            <w:r/>
-            <w:r>
-              <w:rPr>
-                <w:rFonts w:ascii="Calibri" w:hAnsi="Calibri" w:eastAsia="Calibri"/>
-                <w:b w:val="0"/>
-                <w:color w:val="1D1917"/>
-                <w:sz w:val="20"/>
-              </w:rPr>
-              <w:t>string</w:t>
-            </w:r>
-          </w:p>
-        </w:tc>
-        <w:tc>
-          <w:tcPr>
-            <w:tcW w:type="dxa" w:w="3249"/>
-            <w:shd w:fill="FFFFFF" w:val="clear"/>
-          </w:tcPr>
-          <w:p>
-            <w:r/>
-            <w:r>
-              <w:rPr>
-                <w:rFonts w:ascii="Calibri" w:hAnsi="Calibri" w:eastAsia="Calibri"/>
-                <w:b w:val="0"/>
-                <w:color w:val="1D1917"/>
-                <w:sz w:val="20"/>
-              </w:rPr>
-              <w:t>Slug único para URL pública (/vinos/{slug}).</w:t>
-            </w:r>
-          </w:p>
-        </w:tc>
-      </w:tr>
-      <w:tr>
-        <w:tc>
-          <w:tcPr>
-            <w:tcW w:type="dxa" w:w="3249"/>
-            <w:shd w:fill="F7F3EE" w:val="clear"/>
-          </w:tcPr>
-          <w:p>
-            <w:r/>
-            <w:r>
-              <w:rPr>
-                <w:rFonts w:ascii="Calibri" w:hAnsi="Calibri" w:eastAsia="Calibri"/>
-                <w:b w:val="0"/>
-                <w:color w:val="1D1917"/>
-                <w:sz w:val="20"/>
-              </w:rPr>
-              <w:t>items[].description</w:t>
-            </w:r>
-          </w:p>
-        </w:tc>
-        <w:tc>
-          <w:tcPr>
-            <w:tcW w:type="dxa" w:w="3249"/>
-            <w:shd w:fill="F7F3EE" w:val="clear"/>
-          </w:tcPr>
-          <w:p>
-            <w:r/>
-            <w:r>
-              <w:rPr>
-                <w:rFonts w:ascii="Calibri" w:hAnsi="Calibri" w:eastAsia="Calibri"/>
-                <w:b w:val="0"/>
-                <w:color w:val="1D1917"/>
-                <w:sz w:val="20"/>
-              </w:rPr>
-              <w:t>string</w:t>
-            </w:r>
-          </w:p>
-        </w:tc>
-        <w:tc>
-          <w:tcPr>
-            <w:tcW w:type="dxa" w:w="3249"/>
-            <w:shd w:fill="F7F3EE" w:val="clear"/>
-          </w:tcPr>
-          <w:p>
-            <w:r/>
-            <w:r>
-              <w:rPr>
-                <w:rFonts w:ascii="Calibri" w:hAnsi="Calibri" w:eastAsia="Calibri"/>
-                <w:b w:val="0"/>
-                <w:color w:val="1D1917"/>
-                <w:sz w:val="20"/>
-              </w:rPr>
-              <w:t>Descripción almacenada.</w:t>
-            </w:r>
-          </w:p>
-        </w:tc>
-      </w:tr>
-      <w:tr>
-        <w:tc>
-          <w:tcPr>
-            <w:tcW w:type="dxa" w:w="3249"/>
-            <w:shd w:fill="FFFFFF" w:val="clear"/>
-          </w:tcPr>
-          <w:p>
-            <w:r/>
-            <w:r>
-              <w:rPr>
-                <w:rFonts w:ascii="Calibri" w:hAnsi="Calibri" w:eastAsia="Calibri"/>
-                <w:b w:val="0"/>
-                <w:color w:val="1D1917"/>
-                <w:sz w:val="20"/>
-              </w:rPr>
-              <w:t>items[].price</w:t>
-            </w:r>
-          </w:p>
-        </w:tc>
-        <w:tc>
-          <w:tcPr>
-            <w:tcW w:type="dxa" w:w="3249"/>
-            <w:shd w:fill="FFFFFF" w:val="clear"/>
-          </w:tcPr>
-          <w:p>
-            <w:r/>
-            <w:r>
-              <w:rPr>
-                <w:rFonts w:ascii="Calibri" w:hAnsi="Calibri" w:eastAsia="Calibri"/>
-                <w:b w:val="0"/>
-                <w:color w:val="1D1917"/>
-                <w:sz w:val="20"/>
-              </w:rPr>
-              <w:t>number</w:t>
-            </w:r>
-          </w:p>
-        </w:tc>
-        <w:tc>
-          <w:tcPr>
-            <w:tcW w:type="dxa" w:w="3249"/>
-            <w:shd w:fill="FFFFFF" w:val="clear"/>
-          </w:tcPr>
-          <w:p>
-            <w:r/>
-            <w:r>
-              <w:rPr>
-                <w:rFonts w:ascii="Calibri" w:hAnsi="Calibri" w:eastAsia="Calibri"/>
-                <w:b w:val="0"/>
-                <w:color w:val="1D1917"/>
-                <w:sz w:val="20"/>
-              </w:rPr>
-              <w:t>Precio con 2 decimales (numeric 12,2).</w:t>
-            </w:r>
-          </w:p>
-        </w:tc>
-      </w:tr>
-      <w:tr>
-        <w:tc>
-          <w:tcPr>
-            <w:tcW w:type="dxa" w:w="3249"/>
-            <w:shd w:fill="F7F3EE" w:val="clear"/>
-          </w:tcPr>
-          <w:p>
-            <w:r/>
-            <w:r>
-              <w:rPr>
-                <w:rFonts w:ascii="Calibri" w:hAnsi="Calibri" w:eastAsia="Calibri"/>
-                <w:b w:val="0"/>
-                <w:color w:val="1D1917"/>
-                <w:sz w:val="20"/>
-              </w:rPr>
-              <w:t>items[].vatRate</w:t>
-            </w:r>
-          </w:p>
-        </w:tc>
-        <w:tc>
-          <w:tcPr>
-            <w:tcW w:type="dxa" w:w="3249"/>
-            <w:shd w:fill="F7F3EE" w:val="clear"/>
-          </w:tcPr>
-          <w:p>
-            <w:r/>
-            <w:r>
-              <w:rPr>
-                <w:rFonts w:ascii="Calibri" w:hAnsi="Calibri" w:eastAsia="Calibri"/>
-                <w:b w:val="0"/>
-                <w:color w:val="1D1917"/>
-                <w:sz w:val="20"/>
-              </w:rPr>
-              <w:t>number</w:t>
-            </w:r>
-          </w:p>
-        </w:tc>
-        <w:tc>
-          <w:tcPr>
-            <w:tcW w:type="dxa" w:w="3249"/>
-            <w:shd w:fill="F7F3EE" w:val="clear"/>
-          </w:tcPr>
-          <w:p>
-            <w:r/>
-            <w:r>
-              <w:rPr>
-                <w:rFonts w:ascii="Calibri" w:hAnsi="Calibri" w:eastAsia="Calibri"/>
-                <w:b w:val="0"/>
-                <w:color w:val="1D1917"/>
-                <w:sz w:val="20"/>
-              </w:rPr>
-              <w:t>Tipo de IVA (numeric 5,2). Informativo en listado.</w:t>
-            </w:r>
-          </w:p>
-        </w:tc>
-      </w:tr>
-      <w:tr>
-        <w:tc>
-          <w:tcPr>
-            <w:tcW w:type="dxa" w:w="3249"/>
-            <w:shd w:fill="FFFFFF" w:val="clear"/>
-          </w:tcPr>
-          <w:p>
-            <w:r/>
-            <w:r>
-              <w:rPr>
-                <w:rFonts w:ascii="Calibri" w:hAnsi="Calibri" w:eastAsia="Calibri"/>
-                <w:b w:val="0"/>
-                <w:color w:val="1D1917"/>
-                <w:sz w:val="20"/>
-              </w:rPr>
-              <w:t>items[].categoryId</w:t>
-            </w:r>
-          </w:p>
-        </w:tc>
-        <w:tc>
-          <w:tcPr>
-            <w:tcW w:type="dxa" w:w="3249"/>
-            <w:shd w:fill="FFFFFF" w:val="clear"/>
-          </w:tcPr>
-          <w:p>
-            <w:r/>
-            <w:r>
-              <w:rPr>
-                <w:rFonts w:ascii="Calibri" w:hAnsi="Calibri" w:eastAsia="Calibri"/>
-                <w:b w:val="0"/>
-                <w:color w:val="1D1917"/>
-                <w:sz w:val="20"/>
-              </w:rPr>
-              <w:t>uuid</w:t>
-            </w:r>
-          </w:p>
-        </w:tc>
-        <w:tc>
-          <w:tcPr>
-            <w:tcW w:type="dxa" w:w="3249"/>
-            <w:shd w:fill="FFFFFF" w:val="clear"/>
-          </w:tcPr>
-          <w:p>
-            <w:r/>
-            <w:r>
-              <w:rPr>
-                <w:rFonts w:ascii="Calibri" w:hAnsi="Calibri" w:eastAsia="Calibri"/>
-                <w:b w:val="0"/>
-                <w:color w:val="1D1917"/>
-                <w:sz w:val="20"/>
-              </w:rPr>
-              <w:t>FK a Categories.</w:t>
-            </w:r>
-          </w:p>
-        </w:tc>
-      </w:tr>
-      <w:tr>
-        <w:tc>
-          <w:tcPr>
-            <w:tcW w:type="dxa" w:w="3249"/>
-            <w:shd w:fill="F7F3EE" w:val="clear"/>
-          </w:tcPr>
-          <w:p>
-            <w:r/>
-            <w:r>
-              <w:rPr>
-                <w:rFonts w:ascii="Calibri" w:hAnsi="Calibri" w:eastAsia="Calibri"/>
-                <w:b w:val="0"/>
-                <w:color w:val="1D1917"/>
-                <w:sz w:val="20"/>
-              </w:rPr>
-              <w:t>items[].categoryName</w:t>
-            </w:r>
-          </w:p>
-        </w:tc>
-        <w:tc>
-          <w:tcPr>
-            <w:tcW w:type="dxa" w:w="3249"/>
-            <w:shd w:fill="F7F3EE" w:val="clear"/>
-          </w:tcPr>
-          <w:p>
-            <w:r/>
-            <w:r>
-              <w:rPr>
-                <w:rFonts w:ascii="Calibri" w:hAnsi="Calibri" w:eastAsia="Calibri"/>
-                <w:b w:val="0"/>
-                <w:color w:val="1D1917"/>
-                <w:sz w:val="20"/>
-              </w:rPr>
-              <w:t>string</w:t>
-            </w:r>
-          </w:p>
-        </w:tc>
-        <w:tc>
-          <w:tcPr>
-            <w:tcW w:type="dxa" w:w="3249"/>
-            <w:shd w:fill="F7F3EE" w:val="clear"/>
-          </w:tcPr>
-          <w:p>
-            <w:r/>
-            <w:r>
-              <w:rPr>
-                <w:rFonts w:ascii="Calibri" w:hAnsi="Calibri" w:eastAsia="Calibri"/>
-                <w:b w:val="0"/>
-                <w:color w:val="1D1917"/>
-                <w:sz w:val="20"/>
-              </w:rPr>
-              <w:t>Nombre de categoría (join).</w:t>
-            </w:r>
-          </w:p>
-        </w:tc>
-      </w:tr>
-      <w:tr>
-        <w:tc>
-          <w:tcPr>
-            <w:tcW w:type="dxa" w:w="3249"/>
-            <w:shd w:fill="FFFFFF" w:val="clear"/>
-          </w:tcPr>
-          <w:p>
-            <w:r/>
-            <w:r>
-              <w:rPr>
-                <w:rFonts w:ascii="Calibri" w:hAnsi="Calibri" w:eastAsia="Calibri"/>
-                <w:b w:val="0"/>
-                <w:color w:val="1D1917"/>
-                <w:sz w:val="20"/>
-              </w:rPr>
-              <w:t>items[].categorySlug</w:t>
-            </w:r>
-          </w:p>
-        </w:tc>
-        <w:tc>
-          <w:tcPr>
-            <w:tcW w:type="dxa" w:w="3249"/>
-            <w:shd w:fill="FFFFFF" w:val="clear"/>
-          </w:tcPr>
-          <w:p>
-            <w:r/>
-            <w:r>
-              <w:rPr>
-                <w:rFonts w:ascii="Calibri" w:hAnsi="Calibri" w:eastAsia="Calibri"/>
-                <w:b w:val="0"/>
-                <w:color w:val="1D1917"/>
-                <w:sz w:val="20"/>
-              </w:rPr>
-              <w:t>string</w:t>
-            </w:r>
-          </w:p>
-        </w:tc>
-        <w:tc>
-          <w:tcPr>
-            <w:tcW w:type="dxa" w:w="3249"/>
-            <w:shd w:fill="FFFFFF" w:val="clear"/>
-          </w:tcPr>
-          <w:p>
-            <w:r/>
-            <w:r>
-              <w:rPr>
-                <w:rFonts w:ascii="Calibri" w:hAnsi="Calibri" w:eastAsia="Calibri"/>
-                <w:b w:val="0"/>
-                <w:color w:val="1D1917"/>
-                <w:sz w:val="20"/>
-              </w:rPr>
-              <w:t>Slug de categoría para filtros.</w:t>
+              <w:t>Referencia, nombre, slug, categoría, precio, IVA, estado, fecha de actualización.</w:t>
             </w:r>
           </w:p>
         </w:tc>
@@ -2905,7 +2346,7 @@
           <w:color w:val="1D1917"/>
           <w:sz w:val="22"/>
         </w:rPr>
-        <w:t>Solo se devuelven productos con Active = true y categoría Active = true. No hay borrado físico de productos con histórico; se desactivan.</w:t>
+        <w:t>Enlaces del propio panel: Swagger, GET /api/v1/products y GET /api/v1/categories.</w:t>
       </w:r>
     </w:p>
     <w:p>
@@ -2917,25 +2358,243 @@
           <w:rFonts w:ascii="Calibri" w:hAnsi="Calibri"/>
           <w:color w:val="421F25"/>
         </w:rPr>
-        <w:t>4.5 Errores</w:t>
+        <w:t>4.3 Crear una categoría</w:t>
+      </w:r>
+    </w:p>
+    <w:p>
+      <w:pPr>
+        <w:spacing w:after="160"/>
+      </w:pPr>
+      <w:r>
+        <w:rPr>
+          <w:rFonts w:ascii="Calibri" w:hAnsi="Calibri" w:eastAsia="Calibri"/>
+          <w:b w:val="0"/>
+          <w:color w:val="1D1917"/>
+          <w:sz w:val="22"/>
+        </w:rPr>
+        <w:t>1. Abrir /admin.</w:t>
+      </w:r>
+    </w:p>
+    <w:p>
+      <w:pPr>
+        <w:spacing w:after="160"/>
+      </w:pPr>
+      <w:r>
+        <w:rPr>
+          <w:rFonts w:ascii="Calibri" w:hAnsi="Calibri" w:eastAsia="Calibri"/>
+          <w:b w:val="0"/>
+          <w:color w:val="1D1917"/>
+          <w:sz w:val="22"/>
+        </w:rPr>
+        <w:t>2. En «Nueva categoría», indicar Nombre (obligatorio).</w:t>
+      </w:r>
+    </w:p>
+    <w:p>
+      <w:pPr>
+        <w:spacing w:after="160"/>
+      </w:pPr>
+      <w:r>
+        <w:rPr>
+          <w:rFonts w:ascii="Calibri" w:hAnsi="Calibri" w:eastAsia="Calibri"/>
+          <w:b w:val="0"/>
+          <w:color w:val="1D1917"/>
+          <w:sz w:val="22"/>
+        </w:rPr>
+        <w:t>3. Slug opcional. Si se deja vacío se genera a partir del nombre (minúsculas, sin acentos, guiones).</w:t>
+      </w:r>
+    </w:p>
+    <w:p>
+      <w:pPr>
+        <w:spacing w:after="160"/>
+      </w:pPr>
+      <w:r>
+        <w:rPr>
+          <w:rFonts w:ascii="Calibri" w:hAnsi="Calibri" w:eastAsia="Calibri"/>
+          <w:b w:val="0"/>
+          <w:color w:val="1D1917"/>
+          <w:sz w:val="22"/>
+        </w:rPr>
+        <w:t>4. Categoría padre opcional (jerarquía).</w:t>
+      </w:r>
+    </w:p>
+    <w:p>
+      <w:pPr>
+        <w:spacing w:after="160"/>
+      </w:pPr>
+      <w:r>
+        <w:rPr>
+          <w:rFonts w:ascii="Calibri" w:hAnsi="Calibri" w:eastAsia="Calibri"/>
+          <w:b w:val="0"/>
+          <w:color w:val="1D1917"/>
+          <w:sz w:val="22"/>
+        </w:rPr>
+        <w:t>5. Marcar Activa si debe aparecer en GET /api/v1/categories.</w:t>
+      </w:r>
+    </w:p>
+    <w:p>
+      <w:pPr>
+        <w:spacing w:after="160"/>
+      </w:pPr>
+      <w:r>
+        <w:rPr>
+          <w:rFonts w:ascii="Calibri" w:hAnsi="Calibri" w:eastAsia="Calibri"/>
+          <w:b w:val="0"/>
+          <w:color w:val="1D1917"/>
+          <w:sz w:val="22"/>
+        </w:rPr>
+        <w:t>6. Guardar categoría.</w:t>
+      </w:r>
+    </w:p>
+    <w:p>
+      <w:pPr>
+        <w:spacing w:after="160"/>
+      </w:pPr>
+      <w:r>
+        <w:rPr>
+          <w:rFonts w:ascii="Calibri" w:hAnsi="Calibri" w:eastAsia="Calibri"/>
+          <w:b w:val="0"/>
+          <w:color w:val="1D1917"/>
+          <w:sz w:val="22"/>
+        </w:rPr>
+        <w:t>Reglas: nombre ≤ 150, slug único ≤ 180. Un slug duplicado muestra error en pantalla.</w:t>
+      </w:r>
+    </w:p>
+    <w:p>
+      <w:pPr>
+        <w:pStyle w:val="Heading2"/>
+      </w:pPr>
+      <w:r>
+        <w:rPr>
+          <w:rFonts w:ascii="Calibri" w:hAnsi="Calibri"/>
+          <w:color w:val="421F25"/>
+        </w:rPr>
+        <w:t>4.4 Crear un producto</w:t>
+      </w:r>
+    </w:p>
+    <w:p>
+      <w:pPr>
+        <w:spacing w:after="160"/>
+      </w:pPr>
+      <w:r>
+        <w:rPr>
+          <w:rFonts w:ascii="Calibri" w:hAnsi="Calibri" w:eastAsia="Calibri"/>
+          <w:b w:val="0"/>
+          <w:color w:val="1D1917"/>
+          <w:sz w:val="22"/>
+        </w:rPr>
+        <w:t>1. Debe existir al menos una categoría.</w:t>
+      </w:r>
+    </w:p>
+    <w:p>
+      <w:pPr>
+        <w:spacing w:after="160"/>
+      </w:pPr>
+      <w:r>
+        <w:rPr>
+          <w:rFonts w:ascii="Calibri" w:hAnsi="Calibri" w:eastAsia="Calibri"/>
+          <w:b w:val="0"/>
+          <w:color w:val="1D1917"/>
+          <w:sz w:val="22"/>
+        </w:rPr>
+        <w:t>2. Completar Referencia (única, ≤ 80), Categoría, Nombre (≤ 200).</w:t>
+      </w:r>
+    </w:p>
+    <w:p>
+      <w:pPr>
+        <w:spacing w:after="160"/>
+      </w:pPr>
+      <w:r>
+        <w:rPr>
+          <w:rFonts w:ascii="Calibri" w:hAnsi="Calibri" w:eastAsia="Calibri"/>
+          <w:b w:val="0"/>
+          <w:color w:val="1D1917"/>
+          <w:sz w:val="22"/>
+        </w:rPr>
+        <w:t>3. Slug opcional; si falta se genera del nombre (≤ 220, único).</w:t>
+      </w:r>
+    </w:p>
+    <w:p>
+      <w:pPr>
+        <w:spacing w:after="160"/>
+      </w:pPr>
+      <w:r>
+        <w:rPr>
+          <w:rFonts w:ascii="Calibri" w:hAnsi="Calibri" w:eastAsia="Calibri"/>
+          <w:b w:val="0"/>
+          <w:color w:val="1D1917"/>
+          <w:sz w:val="22"/>
+        </w:rPr>
+        <w:t>4. Descripción, Precio (admite 15,50 o 15.50) e IVA (por defecto 21).</w:t>
+      </w:r>
+    </w:p>
+    <w:p>
+      <w:pPr>
+        <w:spacing w:after="160"/>
+      </w:pPr>
+      <w:r>
+        <w:rPr>
+          <w:rFonts w:ascii="Calibri" w:hAnsi="Calibri" w:eastAsia="Calibri"/>
+          <w:b w:val="0"/>
+          <w:color w:val="1D1917"/>
+          <w:sz w:val="22"/>
+        </w:rPr>
+        <w:t>5. «Activo en el catálogo público»: si está marcado, el producto aparece en GET /api/v1/products y en Angular.</w:t>
+      </w:r>
+    </w:p>
+    <w:p>
+      <w:pPr>
+        <w:spacing w:after="160"/>
+      </w:pPr>
+      <w:r>
+        <w:rPr>
+          <w:rFonts w:ascii="Calibri" w:hAnsi="Calibri" w:eastAsia="Calibri"/>
+          <w:b w:val="0"/>
+          <w:color w:val="1D1917"/>
+          <w:sz w:val="22"/>
+        </w:rPr>
+        <w:t>6. Guardar producto. Un mensaje verde confirma el alta.</w:t>
+      </w:r>
+    </w:p>
+    <w:p>
+      <w:pPr>
+        <w:spacing w:after="160"/>
+      </w:pPr>
+      <w:r>
+        <w:rPr>
+          <w:rFonts w:ascii="Calibri" w:hAnsi="Calibri" w:eastAsia="Calibri"/>
+          <w:b w:val="0"/>
+          <w:color w:val="1D1917"/>
+          <w:sz w:val="22"/>
+        </w:rPr>
+        <w:t>El listado público NUNCA usa el precio enviado por Angular: el precio guardado aquí es la fuente de verdad.</w:t>
+      </w:r>
+    </w:p>
+    <w:p>
+      <w:pPr>
+        <w:pStyle w:val="Heading2"/>
+      </w:pPr>
+      <w:r>
+        <w:rPr>
+          <w:rFonts w:ascii="Calibri" w:hAnsi="Calibri"/>
+          <w:color w:val="421F25"/>
+        </w:rPr>
+        <w:t>4.5 Relación panel ↔ API pública ↔ Angular</w:t>
       </w:r>
     </w:p>
     <w:tbl>
       <w:tblPr>
         <w:tblStyle w:val="TableGrid"/>
         <w:tblW w:type="auto" w:w="0"/>
-        <w:tblLayout w:type="autofit"/>
         <w:tblLook w:firstColumn="1" w:firstRow="1" w:lastColumn="0" w:lastRow="0" w:noHBand="0" w:noVBand="1" w:val="04A0"/>
       </w:tblPr>
       <w:tblGrid>
-        <w:gridCol w:w="3249"/>
-        <w:gridCol w:w="3249"/>
-        <w:gridCol w:w="3249"/>
+        <w:gridCol w:w="4873"/>
+        <w:gridCol w:w="4873"/>
       </w:tblGrid>
       <w:tr>
         <w:tc>
           <w:tcPr>
-            <w:tcW w:type="dxa" w:w="3249"/>
+            <w:tcW w:type="dxa" w:w="4873"/>
             <w:shd w:fill="421F25" w:val="clear"/>
           </w:tcPr>
           <w:p>
@@ -2947,13 +2606,13 @@
                 <w:color w:val="FFFFFF"/>
                 <w:sz w:val="20"/>
               </w:rPr>
-              <w:t>HTTP</w:t>
+              <w:t>Acción en /admin</w:t>
             </w:r>
           </w:p>
         </w:tc>
         <w:tc>
           <w:tcPr>
-            <w:tcW w:type="dxa" w:w="3249"/>
+            <w:tcW w:type="dxa" w:w="4873"/>
             <w:shd w:fill="421F25" w:val="clear"/>
           </w:tcPr>
           <w:p>
@@ -2965,25 +2624,7 @@
                 <w:color w:val="FFFFFF"/>
                 <w:sz w:val="20"/>
               </w:rPr>
-              <w:t>Cuándo</w:t>
-            </w:r>
-          </w:p>
-        </w:tc>
-        <w:tc>
-          <w:tcPr>
-            <w:tcW w:type="dxa" w:w="3249"/>
-            <w:shd w:fill="421F25" w:val="clear"/>
-          </w:tcPr>
-          <w:p>
-            <w:r/>
-            <w:r>
-              <w:rPr>
-                <w:rFonts w:ascii="Calibri" w:hAnsi="Calibri" w:eastAsia="Calibri"/>
-                <w:b/>
-                <w:color w:val="FFFFFF"/>
-                <w:sz w:val="20"/>
-              </w:rPr>
-              <w:t>Cuerpo</w:t>
+              <w:t>Efecto</w:t>
             </w:r>
           </w:p>
         </w:tc>
@@ -2991,7 +2632,7 @@
       <w:tr>
         <w:tc>
           <w:tcPr>
-            <w:tcW w:type="dxa" w:w="3249"/>
+            <w:tcW w:type="dxa" w:w="4873"/>
             <w:shd w:fill="FFFFFF" w:val="clear"/>
           </w:tcPr>
           <w:p>
@@ -3003,13 +2644,13 @@
                 <w:color w:val="1D1917"/>
                 <w:sz w:val="20"/>
               </w:rPr>
-              <w:t>200</w:t>
+              <w:t>Alta de categoría activa</w:t>
             </w:r>
           </w:p>
         </w:tc>
         <w:tc>
           <w:tcPr>
-            <w:tcW w:type="dxa" w:w="3249"/>
+            <w:tcW w:type="dxa" w:w="4873"/>
             <w:shd w:fill="FFFFFF" w:val="clear"/>
           </w:tcPr>
           <w:p>
@@ -3021,13 +2662,53 @@
                 <w:color w:val="1D1917"/>
                 <w:sz w:val="20"/>
               </w:rPr>
-              <w:t>Petición válida, aunque items esté vacío.</w:t>
+              <w:t>Sale en GET /api/v1/categories y en el desplegable del panel.</w:t>
+            </w:r>
+          </w:p>
+        </w:tc>
+      </w:tr>
+      <w:tr>
+        <w:tc>
+          <w:tcPr>
+            <w:tcW w:type="dxa" w:w="4873"/>
+            <w:shd w:fill="F7F3EE" w:val="clear"/>
+          </w:tcPr>
+          <w:p>
+            <w:r/>
+            <w:r>
+              <w:rPr>
+                <w:rFonts w:ascii="Calibri" w:hAnsi="Calibri" w:eastAsia="Calibri"/>
+                <w:b w:val="0"/>
+                <w:color w:val="1D1917"/>
+                <w:sz w:val="20"/>
+              </w:rPr>
+              <w:t>Alta de producto activo</w:t>
             </w:r>
           </w:p>
         </w:tc>
         <w:tc>
           <w:tcPr>
-            <w:tcW w:type="dxa" w:w="3249"/>
+            <w:tcW w:type="dxa" w:w="4873"/>
+            <w:shd w:fill="F7F3EE" w:val="clear"/>
+          </w:tcPr>
+          <w:p>
+            <w:r/>
+            <w:r>
+              <w:rPr>
+                <w:rFonts w:ascii="Calibri" w:hAnsi="Calibri" w:eastAsia="Calibri"/>
+                <w:b w:val="0"/>
+                <w:color w:val="1D1917"/>
+                <w:sz w:val="20"/>
+              </w:rPr>
+              <w:t>Sale en GET /api/v1/products, GET /api/v1/products/{slug} y en /vinos del front.</w:t>
+            </w:r>
+          </w:p>
+        </w:tc>
+      </w:tr>
+      <w:tr>
+        <w:tc>
+          <w:tcPr>
+            <w:tcW w:type="dxa" w:w="4873"/>
             <w:shd w:fill="FFFFFF" w:val="clear"/>
           </w:tcPr>
           <w:p>
@@ -3039,71 +2720,13 @@
                 <w:color w:val="1D1917"/>
                 <w:sz w:val="20"/>
               </w:rPr>
-              <w:t>PagedResult descrito arriba.</w:t>
-            </w:r>
-          </w:p>
-        </w:tc>
-      </w:tr>
-      <w:tr>
-        <w:tc>
-          <w:tcPr>
-            <w:tcW w:type="dxa" w:w="3249"/>
-            <w:shd w:fill="F7F3EE" w:val="clear"/>
-          </w:tcPr>
-          <w:p>
-            <w:r/>
-            <w:r>
-              <w:rPr>
-                <w:rFonts w:ascii="Calibri" w:hAnsi="Calibri" w:eastAsia="Calibri"/>
-                <w:b w:val="0"/>
-                <w:color w:val="1D1917"/>
-                <w:sz w:val="20"/>
-              </w:rPr>
-              <w:t>400</w:t>
+              <w:t>Producto o categoría inactiva</w:t>
             </w:r>
           </w:p>
         </w:tc>
         <w:tc>
           <w:tcPr>
-            <w:tcW w:type="dxa" w:w="3249"/>
-            <w:shd w:fill="F7F3EE" w:val="clear"/>
-          </w:tcPr>
-          <w:p>
-            <w:r/>
-            <w:r>
-              <w:rPr>
-                <w:rFonts w:ascii="Calibri" w:hAnsi="Calibri" w:eastAsia="Calibri"/>
-                <w:b w:val="0"/>
-                <w:color w:val="1D1917"/>
-                <w:sz w:val="20"/>
-              </w:rPr>
-              <w:t>page &lt; 1; pageSize fuera de 1–100; precios negativos; minPrice &gt; maxPrice.</w:t>
-            </w:r>
-          </w:p>
-        </w:tc>
-        <w:tc>
-          <w:tcPr>
-            <w:tcW w:type="dxa" w:w="3249"/>
-            <w:shd w:fill="F7F3EE" w:val="clear"/>
-          </w:tcPr>
-          <w:p>
-            <w:r/>
-            <w:r>
-              <w:rPr>
-                <w:rFonts w:ascii="Calibri" w:hAnsi="Calibri" w:eastAsia="Calibri"/>
-                <w:b w:val="0"/>
-                <w:color w:val="1D1917"/>
-                <w:sz w:val="20"/>
-              </w:rPr>
-              <w:t>{ "error": "mensaje" }</w:t>
-            </w:r>
-          </w:p>
-        </w:tc>
-      </w:tr>
-      <w:tr>
-        <w:tc>
-          <w:tcPr>
-            <w:tcW w:type="dxa" w:w="3249"/>
+            <w:tcW w:type="dxa" w:w="4873"/>
             <w:shd w:fill="FFFFFF" w:val="clear"/>
           </w:tcPr>
           <w:p>
@@ -3115,43 +2738,7 @@
                 <w:color w:val="1D1917"/>
                 <w:sz w:val="20"/>
               </w:rPr>
-              <w:t>500</w:t>
-            </w:r>
-          </w:p>
-        </w:tc>
-        <w:tc>
-          <w:tcPr>
-            <w:tcW w:type="dxa" w:w="3249"/>
-            <w:shd w:fill="FFFFFF" w:val="clear"/>
-          </w:tcPr>
-          <w:p>
-            <w:r/>
-            <w:r>
-              <w:rPr>
-                <w:rFonts w:ascii="Calibri" w:hAnsi="Calibri" w:eastAsia="Calibri"/>
-                <w:b w:val="0"/>
-                <w:color w:val="1D1917"/>
-                <w:sz w:val="20"/>
-              </w:rPr>
-              <w:t>Fallo interno (por ejemplo, PostgreSQL caído o contraseña no configurada).</w:t>
-            </w:r>
-          </w:p>
-        </w:tc>
-        <w:tc>
-          <w:tcPr>
-            <w:tcW w:type="dxa" w:w="3249"/>
-            <w:shd w:fill="FFFFFF" w:val="clear"/>
-          </w:tcPr>
-          <w:p>
-            <w:r/>
-            <w:r>
-              <w:rPr>
-                <w:rFonts w:ascii="Calibri" w:hAnsi="Calibri" w:eastAsia="Calibri"/>
-                <w:b w:val="0"/>
-                <w:color w:val="1D1917"/>
-                <w:sz w:val="20"/>
-              </w:rPr>
-              <w:t>Problema de infraestructura; revisar logs de la API.</w:t>
+              <w:t>Sigue visible en /admin, oculto en la API pública y en Angular.</w:t>
             </w:r>
           </w:p>
         </w:tc>
@@ -3169,7 +2756,7 @@
           <w:color w:val="1D1917"/>
           <w:sz w:val="22"/>
         </w:rPr>
-        <w:t>Ejemplo de 400:</w:t>
+        <w:t>Comprobación rápida tras un alta:</w:t>
       </w:r>
     </w:p>
     <w:p>
@@ -3184,19 +2771,11 @@
           <w:color w:val="1D1917"/>
           <w:sz w:val="19"/>
         </w:rPr>
-        <w:t>GET http://localhost:5141/api/v1/products?page=0</w:t>
-      </w:r>
-    </w:p>
-    <w:p>
-      <w:pPr>
-        <w:pStyle w:val="Heading1"/>
-      </w:pPr>
-      <w:r>
-        <w:rPr>
-          <w:rFonts w:ascii="Calibri" w:hAnsi="Calibri"/>
-          <w:color w:val="421F25"/>
-        </w:rPr>
-        <w:t>5. Cómo probarla</w:t>
+        <w:t>http://localhost:5141/api/v1/products/{slug}</w:t>
+        <w:br/>
+        <w:t>http://localhost:4200/vinos</w:t>
+        <w:br/>
+        <w:t>http://localhost:4200/vinos/{slug}</w:t>
       </w:r>
     </w:p>
     <w:p>
@@ -3208,7 +2787,7 @@
           <w:rFonts w:ascii="Calibri" w:hAnsi="Calibri"/>
           <w:color w:val="421F25"/>
         </w:rPr>
-        <w:t>5.1 Swagger UI</w:t>
+        <w:t>4.6 Limitaciones actuales del panel</w:t>
       </w:r>
     </w:p>
     <w:p>
@@ -3222,7 +2801,73 @@
           <w:color w:val="1D1917"/>
           <w:sz w:val="22"/>
         </w:rPr>
-        <w:t>Abrir en el navegador:</w:t>
+        <w:t>• No hay edición ni borrado. Los productos no se eliminan físicamente; en el modelo de dominio se desactivan (aún no hay botón de baja).</w:t>
+      </w:r>
+    </w:p>
+    <w:p>
+      <w:pPr>
+        <w:spacing w:after="160"/>
+      </w:pPr>
+      <w:r>
+        <w:rPr>
+          <w:rFonts w:ascii="Calibri" w:hAnsi="Calibri" w:eastAsia="Calibri"/>
+          <w:b w:val="0"/>
+          <w:color w:val="1D1917"/>
+          <w:sz w:val="22"/>
+        </w:rPr>
+        <w:t>• No gestiona lotes, stock, pedidos ni usuarios.</w:t>
+      </w:r>
+    </w:p>
+    <w:p>
+      <w:pPr>
+        <w:spacing w:after="160"/>
+      </w:pPr>
+      <w:r>
+        <w:rPr>
+          <w:rFonts w:ascii="Calibri" w:hAnsi="Calibri" w:eastAsia="Calibri"/>
+          <w:b w:val="0"/>
+          <w:color w:val="1D1917"/>
+          <w:sz w:val="22"/>
+        </w:rPr>
+        <w:t>• Sin login: por eso solo existe en Development.</w:t>
+      </w:r>
+    </w:p>
+    <w:p>
+      <w:pPr>
+        <w:spacing w:after="160"/>
+      </w:pPr>
+      <w:r>
+        <w:rPr>
+          <w:rFonts w:ascii="Calibri" w:hAnsi="Calibri" w:eastAsia="Calibri"/>
+          <w:b w:val="0"/>
+          <w:color w:val="1D1917"/>
+          <w:sz w:val="22"/>
+        </w:rPr>
+        <w:t>• El SaaS interno (gestion.dominiodelasierra.com) sustituirá este panel.</w:t>
+      </w:r>
+    </w:p>
+    <w:p>
+      <w:pPr>
+        <w:pStyle w:val="Heading1"/>
+      </w:pPr>
+      <w:r>
+        <w:rPr>
+          <w:rFonts w:ascii="Calibri" w:hAnsi="Calibri"/>
+          <w:color w:val="421F25"/>
+        </w:rPr>
+        <w:t>5. Cómo probar (resumen)</w:t>
+      </w:r>
+    </w:p>
+    <w:p>
+      <w:pPr>
+        <w:pStyle w:val="Heading2"/>
+      </w:pPr>
+      <w:r>
+        <w:rPr>
+          <w:rFonts w:ascii="Calibri" w:hAnsi="Calibri"/>
+          <w:color w:val="421F25"/>
+        </w:rPr>
+        <w:t>5.1 Swagger</w:t>
       </w:r>
     </w:p>
     <w:p>
@@ -3242,20 +2887,6 @@
     </w:p>
     <w:p>
       <w:pPr>
-        <w:spacing w:after="160"/>
-      </w:pPr>
-      <w:r>
-        <w:rPr>
-          <w:rFonts w:ascii="Calibri" w:hAnsi="Calibri" w:eastAsia="Calibri"/>
-          <w:b w:val="0"/>
-          <w:color w:val="1D1917"/>
-          <w:sz w:val="22"/>
-        </w:rPr>
-        <w:t>Expandir GET /api/v1/products → Try it out → rellenar parámetros → Execute. Se ve el código HTTP y el JSON.</w:t>
-      </w:r>
-    </w:p>
-    <w:p>
-      <w:pPr>
         <w:pStyle w:val="Heading2"/>
       </w:pPr>
       <w:r>
@@ -3263,33 +2894,7 @@
           <w:rFonts w:ascii="Calibri" w:hAnsi="Calibri"/>
           <w:color w:val="421F25"/>
         </w:rPr>
-        <w:t>5.2 Navegador</w:t>
-      </w:r>
-    </w:p>
-    <w:p>
-      <w:pPr>
-        <w:spacing w:after="160"/>
-      </w:pPr>
-      <w:r>
-        <w:rPr>
-          <w:rFonts w:ascii="Calibri" w:hAnsi="Calibri" w:eastAsia="Calibri"/>
-          <w:b w:val="0"/>
-          <w:color w:val="1D1917"/>
-          <w:sz w:val="22"/>
-        </w:rPr>
-        <w:t>Pegar la URL GET en la barra de direcciones. El JSON se muestra en crudo. Sirve para una comprobación rápida de 200.</w:t>
-      </w:r>
-    </w:p>
-    <w:p>
-      <w:pPr>
-        <w:pStyle w:val="Heading2"/>
-      </w:pPr>
-      <w:r>
-        <w:rPr>
-          <w:rFonts w:ascii="Calibri" w:hAnsi="Calibri"/>
-          <w:color w:val="421F25"/>
-        </w:rPr>
-        <w:t>5.3 PowerShell</w:t>
+        <w:t>5.2 PowerShell</w:t>
       </w:r>
     </w:p>
     <w:p>
@@ -3305,6 +2910,22 @@
           <w:sz w:val="19"/>
         </w:rPr>
         <w:t>Invoke-RestMethod "http://localhost:5141/api/v1/products?page=1&amp;pageSize=24" | ConvertTo-Json -Depth 5</w:t>
+        <w:br/>
+        <w:t>Invoke-RestMethod "http://localhost:5141/api/v1/products/vino-crianza" | ConvertTo-Json</w:t>
+        <w:br/>
+        <w:t>Invoke-RestMethod "http://localhost:5141/api/v1/categories" | ConvertTo-Json</w:t>
+      </w:r>
+    </w:p>
+    <w:p>
+      <w:pPr>
+        <w:pStyle w:val="Heading2"/>
+      </w:pPr>
+      <w:r>
+        <w:rPr>
+          <w:rFonts w:ascii="Calibri" w:hAnsi="Calibri"/>
+          <w:color w:val="421F25"/>
+        </w:rPr>
+        <w:t>5.3 Archivo .http</w:t>
       </w:r>
     </w:p>
     <w:p>
@@ -3318,106 +2939,7 @@
           <w:color w:val="1D1917"/>
           <w:sz w:val="22"/>
         </w:rPr>
-        <w:t>Comprobar un 400:</w:t>
-      </w:r>
-    </w:p>
-    <w:p>
-      <w:pPr>
-        <w:spacing w:after="200"/>
-        <w:ind w:left="283"/>
-      </w:pPr>
-      <w:r>
-        <w:rPr>
-          <w:rFonts w:ascii="Consolas" w:hAnsi="Consolas" w:eastAsia="Consolas"/>
-          <w:b w:val="0"/>
-          <w:color w:val="1D1917"/>
-          <w:sz w:val="19"/>
-        </w:rPr>
-        <w:t>try { Invoke-WebRequest "http://localhost:5141/api/v1/products?page=0" -UseBasicParsing } catch { $_.Exception.Response.StatusCode.value__ }</w:t>
-      </w:r>
-    </w:p>
-    <w:p>
-      <w:pPr>
-        <w:pStyle w:val="Heading2"/>
-      </w:pPr>
-      <w:r>
-        <w:rPr>
-          <w:rFonts w:ascii="Calibri" w:hAnsi="Calibri"/>
-          <w:color w:val="421F25"/>
-        </w:rPr>
-        <w:t>5.4 curl (Git Bash o WSL)</w:t>
-      </w:r>
-    </w:p>
-    <w:p>
-      <w:pPr>
-        <w:spacing w:after="200"/>
-        <w:ind w:left="283"/>
-      </w:pPr>
-      <w:r>
-        <w:rPr>
-          <w:rFonts w:ascii="Consolas" w:hAnsi="Consolas" w:eastAsia="Consolas"/>
-          <w:b w:val="0"/>
-          <w:color w:val="1D1917"/>
-          <w:sz w:val="19"/>
-        </w:rPr>
-        <w:t>curl -s "http://localhost:5141/api/v1/products?category=tintos"</w:t>
-      </w:r>
-    </w:p>
-    <w:p>
-      <w:pPr>
-        <w:pStyle w:val="Heading2"/>
-      </w:pPr>
-      <w:r>
-        <w:rPr>
-          <w:rFonts w:ascii="Calibri" w:hAnsi="Calibri"/>
-          <w:color w:val="421F25"/>
-        </w:rPr>
-        <w:t>5.5 Angular (circuito completo)</w:t>
-      </w:r>
-    </w:p>
-    <w:p>
-      <w:pPr>
-        <w:spacing w:after="160"/>
-      </w:pPr>
-      <w:r>
-        <w:rPr>
-          <w:rFonts w:ascii="Calibri" w:hAnsi="Calibri" w:eastAsia="Calibri"/>
-          <w:b w:val="0"/>
-          <w:color w:val="1D1917"/>
-          <w:sz w:val="22"/>
-        </w:rPr>
-        <w:t>Con la API en 5141 y el front en Angular/web (`npm start`), el catálogo llama a este mismo GET. Comprobar:</w:t>
-      </w:r>
-    </w:p>
-    <w:p>
-      <w:pPr>
-        <w:spacing w:after="200"/>
-        <w:ind w:left="283"/>
-      </w:pPr>
-      <w:r>
-        <w:rPr>
-          <w:rFonts w:ascii="Consolas" w:hAnsi="Consolas" w:eastAsia="Consolas"/>
-          <w:b w:val="0"/>
-          <w:color w:val="1D1917"/>
-          <w:sz w:val="19"/>
-        </w:rPr>
-        <w:t>http://localhost:4200/vinos</w:t>
-        <w:br/>
-        <w:t>http://localhost:4200/vinos/vino-crianza</w:t>
-      </w:r>
-    </w:p>
-    <w:p>
-      <w:pPr>
-        <w:spacing w:after="160"/>
-      </w:pPr>
-      <w:r>
-        <w:rPr>
-          <w:rFonts w:ascii="Calibri" w:hAnsi="Calibri" w:eastAsia="Calibri"/>
-          <w:b w:val="0"/>
-          <w:color w:val="1D1917"/>
-          <w:sz w:val="22"/>
-        </w:rPr>
-        <w:t>Dato de referencia actual en base de datos de desarrollo: producto CRZ-001 / Vino Crianza / 18,90 € / categoría tintos. Si Swagger lo muestra y Angular no, revisar que el front use el origen permitido por CORS y que la API esté en el puerto 5141.</w:t>
+        <w:t>En el proyecto Api: DominioDeLaSierra.Api.http (peticiones GET de productos, slug y categorías).</w:t>
       </w:r>
     </w:p>
     <w:p>
@@ -3443,7 +2965,7 @@
           <w:color w:val="1D1917"/>
           <w:sz w:val="22"/>
         </w:rPr>
-        <w:t>• No enviar price, vatRate ni totales en un futuro POST de pedido; el servidor recalculará.</w:t>
+        <w:t>• No enviar price ni vatRate al crear un pedido futuro; el servidor recalculará.</w:t>
       </w:r>
     </w:p>
     <w:p>
@@ -3457,7 +2979,7 @@
           <w:color w:val="1D1917"/>
           <w:sz w:val="22"/>
         </w:rPr>
-        <w:t>• No usar entidades EF ni el modelo de PostgreSQL como contrato; el contrato es el DTO JSON de esta API.</w:t>
+        <w:t>• No usar entidades EF como contrato; el contrato es el JSON de /api/v1.</w:t>
       </w:r>
     </w:p>
     <w:p>
@@ -3471,7 +2993,7 @@
           <w:color w:val="1D1917"/>
           <w:sz w:val="22"/>
         </w:rPr>
-        <w:t>• No asumir 1 pedido = 1 factura ni campos Stripe dentro de Order (módulos futuros).</w:t>
+        <w:t>• No hay /api/v1/admin JSON en esta versión: las altas van por el panel HTML /admin.</w:t>
       </w:r>
     </w:p>
     <w:p>
@@ -3485,21 +3007,7 @@
           <w:color w:val="1D1917"/>
           <w:sz w:val="22"/>
         </w:rPr>
-        <w:t>• No existe todavía GET /api/v1/products/{slug}. La ficha Angular resuelve el slug sobre el listado cargado.</w:t>
-      </w:r>
-    </w:p>
-    <w:p>
-      <w:pPr>
-        <w:spacing w:after="160"/>
-      </w:pPr>
-      <w:r>
-        <w:rPr>
-          <w:rFonts w:ascii="Calibri" w:hAnsi="Calibri" w:eastAsia="Calibri"/>
-          <w:b w:val="0"/>
-          <w:color w:val="1D1917"/>
-          <w:sz w:val="22"/>
-        </w:rPr>
-        <w:t>• No existe autenticación ni /api/v1/admin en esta versión.</w:t>
+        <w:t>• Pedidos, PaymentIntent y webhooks Stripe no están implementados.</w:t>
       </w:r>
     </w:p>
     <w:p>
@@ -3518,7 +3026,6 @@
       <w:tblPr>
         <w:tblStyle w:val="TableGrid"/>
         <w:tblW w:type="auto" w:w="0"/>
-        <w:tblLayout w:type="autofit"/>
         <w:tblLook w:firstColumn="1" w:firstRow="1" w:lastColumn="0" w:lastRow="0" w:noHBand="0" w:noVBand="1" w:val="04A0"/>
       </w:tblPr>
       <w:tblGrid>
@@ -3578,7 +3085,7 @@
                 <w:color w:val="1D1917"/>
                 <w:sz w:val="20"/>
               </w:rPr>
-              <w:t>No connection / no escucha 5141</w:t>
+              <w:t>No escucha 5141</w:t>
             </w:r>
           </w:p>
         </w:tc>
@@ -3596,7 +3103,7 @@
                 <w:color w:val="1D1917"/>
                 <w:sz w:val="20"/>
               </w:rPr>
-              <w:t>Arrancar la API con --launch-profile http. Confirmar Now listening on.</w:t>
+              <w:t>Arrancar con --launch-profile http.</w:t>
             </w:r>
           </w:p>
         </w:tc>
@@ -3616,7 +3123,7 @@
                 <w:color w:val="1D1917"/>
                 <w:sz w:val="20"/>
               </w:rPr>
-              <w:t>Error de contraseña PostgreSQL</w:t>
+              <w:t>/admin 404</w:t>
             </w:r>
           </w:p>
         </w:tc>
@@ -3634,7 +3141,7 @@
                 <w:color w:val="1D1917"/>
                 <w:sz w:val="20"/>
               </w:rPr>
-              <w:t>Existe .env en la raíz del repo con POSTGRES_PASSWORD. No está en appsettings.json.</w:t>
+              <w:t>No es Development, o la API es una instancia antigua sin Razor Pages.</w:t>
             </w:r>
           </w:p>
         </w:tc>
@@ -3654,7 +3161,7 @@
                 <w:color w:val="1D1917"/>
                 <w:sz w:val="20"/>
               </w:rPr>
-              <w:t>relation does not exist</w:t>
+              <w:t>Error de contraseña</w:t>
             </w:r>
           </w:p>
         </w:tc>
@@ -3672,7 +3179,7 @@
                 <w:color w:val="1D1917"/>
                 <w:sz w:val="20"/>
               </w:rPr>
-              <w:t>Aplicar migraciones EF (InitialCatalog). Deben existir Categories, Products, __EFMigrationsHistory.</w:t>
+              <w:t>Existe .env en la raíz con POSTGRES_PASSWORD.</w:t>
             </w:r>
           </w:p>
         </w:tc>
@@ -3692,7 +3199,7 @@
                 <w:color w:val="1D1917"/>
                 <w:sz w:val="20"/>
               </w:rPr>
-              <w:t>items: [] con 200</w:t>
+              <w:t>Alta rechazada por slug/referencia</w:t>
             </w:r>
           </w:p>
         </w:tc>
@@ -3710,7 +3217,7 @@
                 <w:color w:val="1D1917"/>
                 <w:sz w:val="20"/>
               </w:rPr>
-              <w:t>No hay productos Active, la categoría está inactiva, o el filtro no coincide. Probar sin query.</w:t>
+              <w:t>Ya existe ese valor único en PostgreSQL.</w:t>
             </w:r>
           </w:p>
         </w:tc>
@@ -3730,7 +3237,7 @@
                 <w:color w:val="1D1917"/>
                 <w:sz w:val="20"/>
               </w:rPr>
-              <w:t>CORS en el navegador Angular</w:t>
+              <w:t>Panel muestra el producto pero Angular no</w:t>
             </w:r>
           </w:p>
         </w:tc>
@@ -3748,7 +3255,7 @@
                 <w:color w:val="1D1917"/>
                 <w:sz w:val="20"/>
               </w:rPr>
-              <w:t>Origen del front debe ser localhost:4200 o 127.0.0.1:4200. Recargar tras reiniciar la API.</w:t>
+              <w:t>Producto o categoría inactivos, o front apuntando a otra API.</w:t>
             </w:r>
           </w:p>
         </w:tc>
@@ -3768,7 +3275,7 @@
                 <w:color w:val="1D1917"/>
                 <w:sz w:val="20"/>
               </w:rPr>
-              <w:t>Redirect a HTTPS / certificado</w:t>
+              <w:t>CORS en Angular</w:t>
             </w:r>
           </w:p>
         </w:tc>
@@ -3786,7 +3293,7 @@
                 <w:color w:val="1D1917"/>
                 <w:sz w:val="20"/>
               </w:rPr>
-              <w:t>Usar el perfil http (puerto 5141), no mezclar llamadas HTTP con redirección HTTPS.</w:t>
+              <w:t>Origen localhost:4200 o 127.0.0.1:4200; recargar tras reiniciar la API.</w:t>
             </w:r>
           </w:p>
         </w:tc>
@@ -3816,7 +3323,7 @@
           <w:color w:val="1D1917"/>
           <w:sz w:val="22"/>
         </w:rPr>
-        <w:t>Cualquier cambio incompatible (renombrar campos, cambiar el significado de category, alterar la paginación) debe versionarse bajo /api/v2 o documentarse como ruptura. Mientras el prefijo sea /api/v1, los clientes pueden depender de los nombres camelCase de este documento.</w:t>
+        <w:t>Versión 1.1 añade GET /products/{slug}, GET /categories y el panel /admin. Cambios incompatibles en JSON deberán ir a /api/v2 o documentarse como ruptura.</w:t>
       </w:r>
     </w:p>
     <w:sectPr>
@@ -3843,7 +3350,7 @@
         <w:color w:val="5C5450"/>
         <w:sz w:val="16"/>
       </w:rPr>
-      <w:t>Dominio de la Sierra  ·  Manual técnico de uso de la API v1.0  ·  Confidencial / uso interno</w:t>
+      <w:t>Dominio de la Sierra  ·  Manual técnico de uso de la API v1.1  ·  Confidencial / uso interno</w:t>
     </w:r>
   </w:p>
 </w:ftr>

</xml_diff>